<commit_message>
Update benchmarks, NMI paper, and add HPC/integration infrastructure
Benchmarks:
- Attention benchmark updated to 5.0 sigma (v5 source, v4 writeup)
- Executive functions, learning, metacognition, social cognition: v4 writeups and updated notebooks
- NMI paper updated with new results (v2 markdown + docx)
- Interactive HTML visualizations and presentation deck

Infrastructure:
- HPC deployment, DHT observability/security, NATS event backend
- LLM integration and meta-reflection modules
- Robot control (RH) realtime/trajectory/simulation
- Safety learning service
- Docker compose for memory services
- Integration and unit test suites
- Sprint 6 planning data
- Nemotron HPC build scripts (SLURM, Singularity, Mamba)
- BirdCLEF geometric training pipeline
- Atlas monitoring tools

Co-Authored-By: Claude Opus 4.6 (1M context) <noreply@anthropic.com>
</commit_message>
<xml_diff>
--- a/docs/LINKEDIN_ARTICLE_ERISML_INTEGRATION.docx
+++ b/docs/LINKEDIN_ARTICLE_ERISML_INTEGRATION.docx
@@ -1,14 +1,14 @@
 
 <file path=word/document.xml><?xml version="1.0" encoding="utf-8"?>
-<w:document xmlns:w="http://schemas.openxmlformats.org/wordprocessingml/2006/main" xmlns:m="http://schemas.openxmlformats.org/officeDocument/2006/math" xmlns:r="http://schemas.openxmlformats.org/officeDocument/2006/relationships" xmlns:o="urn:schemas-microsoft-com:office:office" xmlns:v="urn:schemas-microsoft-com:vml" xmlns:w10="urn:schemas-microsoft-com:office:word" xmlns:a="http://schemas.openxmlformats.org/drawingml/2006/main" xmlns:pic="http://schemas.openxmlformats.org/drawingml/2006/picture" xmlns:wp="http://schemas.openxmlformats.org/drawingml/2006/wordprocessingDrawing">
+<w:document xmlns:wpc="http://schemas.microsoft.com/office/word/2010/wordprocessingCanvas" xmlns:cx="http://schemas.microsoft.com/office/drawing/2014/chartex" xmlns:cx1="http://schemas.microsoft.com/office/drawing/2015/9/8/chartex" xmlns:cx2="http://schemas.microsoft.com/office/drawing/2015/10/21/chartex" xmlns:cx3="http://schemas.microsoft.com/office/drawing/2016/5/9/chartex" xmlns:cx4="http://schemas.microsoft.com/office/drawing/2016/5/10/chartex" xmlns:cx5="http://schemas.microsoft.com/office/drawing/2016/5/11/chartex" xmlns:cx6="http://schemas.microsoft.com/office/drawing/2016/5/12/chartex" xmlns:cx7="http://schemas.microsoft.com/office/drawing/2016/5/13/chartex" xmlns:cx8="http://schemas.microsoft.com/office/drawing/2016/5/14/chartex" xmlns:mc="http://schemas.openxmlformats.org/markup-compatibility/2006" xmlns:aink="http://schemas.microsoft.com/office/drawing/2016/ink" xmlns:am3d="http://schemas.microsoft.com/office/drawing/2017/model3d" xmlns:o="urn:schemas-microsoft-com:office:office" xmlns:oel="http://schemas.microsoft.com/office/2019/extlst" xmlns:r="http://schemas.openxmlformats.org/officeDocument/2006/relationships" xmlns:m="http://schemas.openxmlformats.org/officeDocument/2006/math" xmlns:v="urn:schemas-microsoft-com:vml" xmlns:wp14="http://schemas.microsoft.com/office/word/2010/wordprocessingDrawing" xmlns:wp="http://schemas.openxmlformats.org/drawingml/2006/wordprocessingDrawing" xmlns:w10="urn:schemas-microsoft-com:office:word" xmlns:w="http://schemas.openxmlformats.org/wordprocessingml/2006/main" xmlns:w14="http://schemas.microsoft.com/office/word/2010/wordml" xmlns:w15="http://schemas.microsoft.com/office/word/2012/wordml" xmlns:w16cex="http://schemas.microsoft.com/office/word/2018/wordml/cex" xmlns:w16cid="http://schemas.microsoft.com/office/word/2016/wordml/cid" xmlns:w16="http://schemas.microsoft.com/office/word/2018/wordml" xmlns:w16du="http://schemas.microsoft.com/office/word/2023/wordml/word16du" xmlns:w16sdtdh="http://schemas.microsoft.com/office/word/2020/wordml/sdtdatahash" xmlns:w16sdtfl="http://schemas.microsoft.com/office/word/2024/wordml/sdtformatlock" xmlns:w16se="http://schemas.microsoft.com/office/word/2015/wordml/symex" xmlns:wpg="http://schemas.microsoft.com/office/word/2010/wordprocessingGroup" xmlns:wpi="http://schemas.microsoft.com/office/word/2010/wordprocessingInk" xmlns:wne="http://schemas.microsoft.com/office/word/2006/wordml" xmlns:wps="http://schemas.microsoft.com/office/word/2010/wordprocessingShape" mc:Ignorable="w14 w15 w16se w16cid w16 w16cex w16sdtdh w16sdtfl w16du wp14">
   <w:body>
-    <w:bookmarkStart w:id="24" w:name="X2e51d1437bf5ef9416e9a9b2bca217404a71a89"/>
     <w:p>
       <w:pPr>
         <w:pStyle w:val="Heading1"/>
       </w:pPr>
-      <w:r>
-        <w:t xml:space="preserve">Bridging Ethical Theory and AGI Architecture: ErisML Integration Update</w:t>
+      <w:bookmarkStart w:id="0" w:name="X2e51d1437bf5ef9416e9a9b2bca217404a71a89"/>
+      <w:r>
+        <w:t>Bridging Ethical Theory and AGI Architecture: ErisML Integration Update</w:t>
       </w:r>
     </w:p>
     <w:p>
@@ -20,13 +20,13 @@
           <w:i/>
           <w:iCs/>
         </w:rPr>
-        <w:t xml:space="preserve">Building safety into the cognitive loop, not bolting it on afterward</w:t>
-      </w:r>
-    </w:p>
-    <w:p>
-      <w:r>
-        <w:pict>
-          <v:rect style="width:0;height:1.5pt" o:hralign="center" o:hrstd="t" o:hr="t"/>
+        <w:t>Building safety into the cognitive loop, not bolting it on afterward</w:t>
+      </w:r>
+    </w:p>
+    <w:p>
+      <w:r>
+        <w:pict w14:anchorId="5433037E">
+          <v:rect id="_x0000_i1025" style="width:0;height:1.5pt" o:hralign="center" o:hrstd="t" o:hr="t"/>
         </w:pict>
       </w:r>
     </w:p>
@@ -35,7 +35,7 @@
         <w:pStyle w:val="FirstParagraph"/>
       </w:pPr>
       <w:r>
-        <w:t xml:space="preserve">I’m pleased to share a significant milestone in our AGI safety research at San Jose State University.</w:t>
+        <w:t>I’m pleased to share a significant milestone in our AGI safety research at San Jose State University.</w:t>
       </w:r>
     </w:p>
     <w:p>
@@ -43,107 +43,194 @@
         <w:pStyle w:val="BodyText"/>
       </w:pPr>
       <w:r>
-        <w:t xml:space="preserve">We’ve completed the formal integration layer between</w:t>
-      </w:r>
-      <w:r>
+        <w:t xml:space="preserve">We’ve completed the formal integration layer between </w:t>
+      </w:r>
+      <w:r>
+        <w:rPr>
+          <w:b/>
+          <w:bCs/>
+        </w:rPr>
+        <w:t>ErisML</w:t>
+      </w:r>
+      <w:r>
+        <w:t xml:space="preserve"> (our ethical reasoning framework) and </w:t>
+      </w:r>
+      <w:r>
+        <w:rPr>
+          <w:b/>
+          <w:bCs/>
+        </w:rPr>
+        <w:t>AGI-HPC</w:t>
+      </w:r>
+      <w:r>
+        <w:t xml:space="preserve"> (our cognitive architecture for safe artificial general intelligence). This work establishes the protocol definitions, reference implementations, and service interfaces that allow ethical evaluation to be woven throughout the cognitive loop—not bolted on as an afterthought.</w:t>
+      </w:r>
+    </w:p>
+    <w:p>
+      <w:pPr>
+        <w:pStyle w:val="Heading2"/>
+      </w:pPr>
+      <w:bookmarkStart w:id="1" w:name="the-problem-were-solving"/>
+      <w:r>
+        <w:t>The Problem We’re Solving</w:t>
+      </w:r>
+    </w:p>
+    <w:p>
+      <w:pPr>
+        <w:pStyle w:val="FirstParagraph"/>
+      </w:pPr>
+      <w:r>
+        <w:t>Most AI safety approaches treat ethics as a filter at the output layer—a final check before actions are taken. This is like putting a safety inspector only at the factory exit while ignoring everything that happens on the production floor.</w:t>
+      </w:r>
+    </w:p>
+    <w:p>
+      <w:pPr>
+        <w:pStyle w:val="BodyText"/>
+      </w:pPr>
+      <w:r>
+        <w:t xml:space="preserve">Our approach is different: </w:t>
+      </w:r>
+      <w:r>
+        <w:rPr>
+          <w:b/>
+          <w:bCs/>
+        </w:rPr>
+        <w:t>safety is not a gate at the end, but woven throughout the cognitive architecture</w:t>
+      </w:r>
+      <w:r>
+        <w:t>.</w:t>
+      </w:r>
+    </w:p>
+    <w:p>
+      <w:pPr>
+        <w:pStyle w:val="Heading2"/>
+      </w:pPr>
+      <w:bookmarkStart w:id="2" w:name="what-we-built"/>
+      <w:bookmarkEnd w:id="1"/>
+      <w:r>
+        <w:t>What We Built</w:t>
+      </w:r>
+    </w:p>
+    <w:p>
+      <w:pPr>
+        <w:pStyle w:val="Heading3"/>
+      </w:pPr>
+      <w:bookmarkStart w:id="3" w:name="three-layer-safety-architecture"/>
+      <w:r>
+        <w:t>Three-Layer Safety Architecture</w:t>
+      </w:r>
+    </w:p>
+    <w:p>
+      <w:pPr>
+        <w:pStyle w:val="SourceCode"/>
+      </w:pPr>
+      <w:r>
+        <w:rPr>
+          <w:rStyle w:val="VerbatimChar"/>
+        </w:rPr>
+        <w:t>┌─────────────────────────────────────────────────────────────┐</w:t>
+      </w:r>
+      <w:r>
+        <w:br/>
+      </w:r>
+      <w:r>
+        <w:rPr>
+          <w:rStyle w:val="VerbatimChar"/>
+        </w:rPr>
+        <w:t>│                 SAFETY GATEWAY                              │</w:t>
+      </w:r>
+      <w:r>
+        <w:br/>
+      </w:r>
+      <w:r>
+        <w:rPr>
+          <w:rStyle w:val="VerbatimChar"/>
+        </w:rPr>
+        <w:t>│  ┌─────────────────────────────────────────────────────────┐│</w:t>
+      </w:r>
+      <w:r>
+        <w:br/>
+      </w:r>
+      <w:r>
+        <w:rPr>
+          <w:rStyle w:val="VerbatimChar"/>
+        </w:rPr>
+        <w:t xml:space="preserve">│  │  ┌──────────┐  ┌──────────┐  ┌──────────┐           </w:t>
+      </w:r>
+      <w:r>
+        <w:rPr>
+          <w:rStyle w:val="VerbatimChar"/>
+        </w:rPr>
         <w:t xml:space="preserve"> </w:t>
       </w:r>
       <w:r>
         <w:rPr>
-          <w:b/>
-          <w:bCs/>
-        </w:rPr>
-        <w:t xml:space="preserve">ErisML</w:t>
-      </w:r>
-      <w:r>
+          <w:rStyle w:val="VerbatimChar"/>
+        </w:rPr>
+        <w:t xml:space="preserve">   ││</w:t>
+      </w:r>
+      <w:r>
+        <w:br/>
+      </w:r>
+      <w:r>
+        <w:rPr>
+          <w:rStyle w:val="VerbatimChar"/>
+        </w:rPr>
+        <w:t xml:space="preserve">│  │  │ Reflex   │→ │ Tactical │→ │Strategic │            </w:t>
+      </w:r>
+      <w:r>
+        <w:rPr>
+          <w:rStyle w:val="VerbatimChar"/>
+        </w:rPr>
         <w:t xml:space="preserve"> </w:t>
       </w:r>
       <w:r>
-        <w:t xml:space="preserve">(our ethical reasoning framework) and</w:t>
-      </w:r>
-      <w:r>
+        <w:rPr>
+          <w:rStyle w:val="VerbatimChar"/>
+        </w:rPr>
+        <w:t xml:space="preserve">  ││</w:t>
+      </w:r>
+      <w:r>
+        <w:br/>
+      </w:r>
+      <w:r>
+        <w:rPr>
+          <w:rStyle w:val="VerbatimChar"/>
+        </w:rPr>
+        <w:t xml:space="preserve">│  │  │ (&lt;100μs) │  │(10-100ms)│  │ (policy) │             </w:t>
+      </w:r>
+      <w:r>
+        <w:rPr>
+          <w:rStyle w:val="VerbatimChar"/>
+        </w:rPr>
         <w:t xml:space="preserve"> </w:t>
       </w:r>
       <w:r>
         <w:rPr>
-          <w:b/>
-          <w:bCs/>
-        </w:rPr>
-        <w:t xml:space="preserve">AGI-HPC</w:t>
-      </w:r>
-      <w:r>
+          <w:rStyle w:val="VerbatimChar"/>
+        </w:rPr>
+        <w:t xml:space="preserve"> ││</w:t>
+      </w:r>
+      <w:r>
+        <w:br/>
+      </w:r>
+      <w:r>
+        <w:rPr>
+          <w:rStyle w:val="VerbatimChar"/>
+        </w:rPr>
+        <w:t xml:space="preserve">│  │  └──────────┘  └──────────┘  └──────────┘              </w:t>
+      </w:r>
+      <w:r>
+        <w:rPr>
+          <w:rStyle w:val="VerbatimChar"/>
+        </w:rPr>
         <w:t xml:space="preserve"> </w:t>
       </w:r>
       <w:r>
-        <w:t xml:space="preserve">(our cognitive architecture for safe artificial general intelligence). This work establishes the protocol definitions, reference implementations, and service interfaces that allow ethical evaluation to be woven throughout the cognitive loop—not bolted on as an afterthought.</w:t>
-      </w:r>
-    </w:p>
-    <w:bookmarkStart w:id="9" w:name="the-problem-were-solving"/>
-    <w:p>
-      <w:pPr>
-        <w:pStyle w:val="Heading2"/>
-      </w:pPr>
-      <w:r>
-        <w:t xml:space="preserve">The Problem We’re Solving</w:t>
-      </w:r>
-    </w:p>
-    <w:p>
-      <w:pPr>
-        <w:pStyle w:val="FirstParagraph"/>
-      </w:pPr>
-      <w:r>
-        <w:t xml:space="preserve">Most AI safety approaches treat ethics as a filter at the output layer—a final check before actions are taken. This is like putting a safety inspector only at the factory exit while ignoring everything that happens on the production floor.</w:t>
-      </w:r>
-    </w:p>
-    <w:p>
-      <w:pPr>
-        <w:pStyle w:val="BodyText"/>
-      </w:pPr>
-      <w:r>
-        <w:t xml:space="preserve">Our approach is different:</w:t>
-      </w:r>
-      <w:r>
-        <w:t xml:space="preserve"> </w:t>
-      </w:r>
-      <w:r>
-        <w:rPr>
-          <w:b/>
-          <w:bCs/>
-        </w:rPr>
-        <w:t xml:space="preserve">safety is not a gate at the end, but woven throughout the cognitive architecture</w:t>
-      </w:r>
-      <w:r>
-        <w:t xml:space="preserve">.</w:t>
-      </w:r>
-    </w:p>
-    <w:bookmarkEnd w:id="9"/>
-    <w:bookmarkStart w:id="13" w:name="what-we-built"/>
-    <w:p>
-      <w:pPr>
-        <w:pStyle w:val="Heading2"/>
-      </w:pPr>
-      <w:r>
-        <w:t xml:space="preserve">What We Built</w:t>
-      </w:r>
-    </w:p>
-    <w:bookmarkStart w:id="10" w:name="three-layer-safety-architecture"/>
-    <w:p>
-      <w:pPr>
-        <w:pStyle w:val="Heading3"/>
-      </w:pPr>
-      <w:r>
-        <w:t xml:space="preserve">Three-Layer Safety Architecture</w:t>
-      </w:r>
-    </w:p>
-    <w:p>
-      <w:pPr>
-        <w:pStyle w:val="SourceCode"/>
-      </w:pPr>
-      <w:r>
         <w:rPr>
           <w:rStyle w:val="VerbatimChar"/>
         </w:rPr>
-        <w:t xml:space="preserve">┌─────────────────────────────────────────────────────────────┐</w:t>
+        <w:t>││</w:t>
       </w:r>
       <w:r>
         <w:br/>
@@ -152,7 +239,7 @@
         <w:rPr>
           <w:rStyle w:val="VerbatimChar"/>
         </w:rPr>
-        <w:t xml:space="preserve">│                 SAFETY GATEWAY                               │</w:t>
+        <w:t>│  │       │              │              │                   ││</w:t>
       </w:r>
       <w:r>
         <w:br/>
@@ -161,7 +248,7 @@
         <w:rPr>
           <w:rStyle w:val="VerbatimChar"/>
         </w:rPr>
-        <w:t xml:space="preserve">│  ┌─────────────────────────────────────────────────────────┐│</w:t>
+        <w:t>│  │       ▼              ▼              ▼                   ││</w:t>
       </w:r>
       <w:r>
         <w:br/>
@@ -170,7 +257,7 @@
         <w:rPr>
           <w:rStyle w:val="VerbatimChar"/>
         </w:rPr>
-        <w:t xml:space="preserve">│  │  ┌──────────┐  ┌──────────┐  ┌──────────┐              ││</w:t>
+        <w:t>│  │  Emergency      ErisML         Governance               ││</w:t>
       </w:r>
       <w:r>
         <w:br/>
@@ -179,7 +266,7 @@
         <w:rPr>
           <w:rStyle w:val="VerbatimChar"/>
         </w:rPr>
-        <w:t xml:space="preserve">│  │  │ Reflex   │→ │ Tactical │→ │Strategic │              ││</w:t>
+        <w:t>│  │   Stops        Evaluation       Policies                ││</w:t>
       </w:r>
       <w:r>
         <w:br/>
@@ -188,7 +275,7 @@
         <w:rPr>
           <w:rStyle w:val="VerbatimChar"/>
         </w:rPr>
-        <w:t xml:space="preserve">│  │  │ (&lt;100μs) │  │(10-100ms)│  │ (policy) │              ││</w:t>
+        <w:t>│  └─────────────────────────────────────────────────────────┘│</w:t>
       </w:r>
       <w:r>
         <w:br/>
@@ -197,61 +284,7 @@
         <w:rPr>
           <w:rStyle w:val="VerbatimChar"/>
         </w:rPr>
-        <w:t xml:space="preserve">│  │  └──────────┘  └──────────┘  └──────────┘              ││</w:t>
-      </w:r>
-      <w:r>
-        <w:br/>
-      </w:r>
-      <w:r>
-        <w:rPr>
-          <w:rStyle w:val="VerbatimChar"/>
-        </w:rPr>
-        <w:t xml:space="preserve">│  │       │              │              │                   ││</w:t>
-      </w:r>
-      <w:r>
-        <w:br/>
-      </w:r>
-      <w:r>
-        <w:rPr>
-          <w:rStyle w:val="VerbatimChar"/>
-        </w:rPr>
-        <w:t xml:space="preserve">│  │       ▼              ▼              ▼                   ││</w:t>
-      </w:r>
-      <w:r>
-        <w:br/>
-      </w:r>
-      <w:r>
-        <w:rPr>
-          <w:rStyle w:val="VerbatimChar"/>
-        </w:rPr>
-        <w:t xml:space="preserve">│  │  Emergency      ErisML         Governance               ││</w:t>
-      </w:r>
-      <w:r>
-        <w:br/>
-      </w:r>
-      <w:r>
-        <w:rPr>
-          <w:rStyle w:val="VerbatimChar"/>
-        </w:rPr>
-        <w:t xml:space="preserve">│  │   Stops        Evaluation       Policies                ││</w:t>
-      </w:r>
-      <w:r>
-        <w:br/>
-      </w:r>
-      <w:r>
-        <w:rPr>
-          <w:rStyle w:val="VerbatimChar"/>
-        </w:rPr>
-        <w:t xml:space="preserve">│  └─────────────────────────────────────────────────────────┘│</w:t>
-      </w:r>
-      <w:r>
-        <w:br/>
-      </w:r>
-      <w:r>
-        <w:rPr>
-          <w:rStyle w:val="VerbatimChar"/>
-        </w:rPr>
-        <w:t xml:space="preserve">└─────────────────────────────────────────────────────────────┘</w:t>
+        <w:t>└─────────────────────────────────────────────────────────────┘</w:t>
       </w:r>
     </w:p>
     <w:p>
@@ -259,7 +292,7 @@
         <w:pStyle w:val="Compact"/>
         <w:numPr>
           <w:ilvl w:val="0"/>
-          <w:numId w:val="1001"/>
+          <w:numId w:val="2"/>
         </w:numPr>
       </w:pPr>
       <w:r>
@@ -267,13 +300,10 @@
           <w:b/>
           <w:bCs/>
         </w:rPr>
-        <w:t xml:space="preserve">Reflex Layer</w:t>
-      </w:r>
-      <w:r>
-        <w:t xml:space="preserve"> </w:t>
-      </w:r>
-      <w:r>
-        <w:t xml:space="preserve">(&lt;100μs) — Hardware-level collision avoidance and emergency stops</w:t>
+        <w:t>Reflex Layer</w:t>
+      </w:r>
+      <w:r>
+        <w:t xml:space="preserve"> (&lt;100μs) — Hardware-level collision avoidance and emergency stops</w:t>
       </w:r>
     </w:p>
     <w:p>
@@ -281,7 +311,7 @@
         <w:pStyle w:val="Compact"/>
         <w:numPr>
           <w:ilvl w:val="0"/>
-          <w:numId w:val="1001"/>
+          <w:numId w:val="2"/>
         </w:numPr>
       </w:pPr>
       <w:r>
@@ -289,13 +319,10 @@
           <w:b/>
           <w:bCs/>
         </w:rPr>
-        <w:t xml:space="preserve">Tactical Layer</w:t>
-      </w:r>
-      <w:r>
-        <w:t xml:space="preserve"> </w:t>
-      </w:r>
-      <w:r>
-        <w:t xml:space="preserve">(10-100ms) — ErisML ethical evaluation through the DEME pipeline</w:t>
+        <w:t>Tactical Layer</w:t>
+      </w:r>
+      <w:r>
+        <w:t xml:space="preserve"> (10-100ms) — ErisML ethical evaluation through the DEME pipeline</w:t>
       </w:r>
     </w:p>
     <w:p>
@@ -303,7 +330,7 @@
         <w:pStyle w:val="Compact"/>
         <w:numPr>
           <w:ilvl w:val="0"/>
-          <w:numId w:val="1001"/>
+          <w:numId w:val="2"/>
         </w:numPr>
       </w:pPr>
       <w:r>
@@ -311,23 +338,21 @@
           <w:b/>
           <w:bCs/>
         </w:rPr>
-        <w:t xml:space="preserve">Strategic Layer</w:t>
-      </w:r>
-      <w:r>
-        <w:t xml:space="preserve"> </w:t>
-      </w:r>
-      <w:r>
-        <w:t xml:space="preserve">— Policy-level governance and human oversight</w:t>
-      </w:r>
-    </w:p>
-    <w:bookmarkEnd w:id="10"/>
-    <w:bookmarkStart w:id="11" w:name="formal-protocol-definitions"/>
+        <w:t>Strategic Layer</w:t>
+      </w:r>
+      <w:r>
+        <w:t xml:space="preserve"> — Policy-level governance and human oversight</w:t>
+      </w:r>
+    </w:p>
     <w:p>
       <w:pPr>
         <w:pStyle w:val="Heading3"/>
       </w:pPr>
-      <w:r>
-        <w:t xml:space="preserve">Formal Protocol Definitions</w:t>
+      <w:bookmarkStart w:id="4" w:name="formal-protocol-definitions"/>
+      <w:bookmarkEnd w:id="3"/>
+      <w:r>
+        <w:lastRenderedPageBreak/>
+        <w:t>Formal Protocol Definitions</w:t>
       </w:r>
     </w:p>
     <w:p>
@@ -335,7 +360,7 @@
         <w:pStyle w:val="FirstParagraph"/>
       </w:pPr>
       <w:r>
-        <w:t xml:space="preserve">We’ve defined gRPC/Protocol Buffer interfaces for:</w:t>
+        <w:t>We’ve defined gRPC/Protocol Buffer interfaces for:</w:t>
       </w:r>
     </w:p>
     <w:p>
@@ -343,7 +368,7 @@
         <w:pStyle w:val="Compact"/>
         <w:numPr>
           <w:ilvl w:val="0"/>
-          <w:numId w:val="1002"/>
+          <w:numId w:val="3"/>
         </w:numPr>
       </w:pPr>
       <w:r>
@@ -351,13 +376,10 @@
           <w:b/>
           <w:bCs/>
         </w:rPr>
-        <w:t xml:space="preserve">EthicalFacts</w:t>
-      </w:r>
-      <w:r>
-        <w:t xml:space="preserve"> </w:t>
-      </w:r>
-      <w:r>
-        <w:t xml:space="preserve">— Capturing the morally relevant dimensions of any action (consequences, rights, fairness, safety, epistemic status)</w:t>
+        <w:t>EthicalFacts</w:t>
+      </w:r>
+      <w:r>
+        <w:t xml:space="preserve"> — Capturing the morally relevant dimensions of any action (consequences, rights, fairness, safety, epistemic status)</w:t>
       </w:r>
     </w:p>
     <w:p>
@@ -365,7 +387,7 @@
         <w:pStyle w:val="Compact"/>
         <w:numPr>
           <w:ilvl w:val="0"/>
-          <w:numId w:val="1002"/>
+          <w:numId w:val="3"/>
         </w:numPr>
       </w:pPr>
       <w:r>
@@ -373,13 +395,10 @@
           <w:b/>
           <w:bCs/>
         </w:rPr>
-        <w:t xml:space="preserve">MoralVector</w:t>
-      </w:r>
-      <w:r>
-        <w:t xml:space="preserve"> </w:t>
-      </w:r>
-      <w:r>
-        <w:t xml:space="preserve">— An 8+1 dimensional ethical assessment</w:t>
+        <w:t>MoralVector</w:t>
+      </w:r>
+      <w:r>
+        <w:t xml:space="preserve"> — An 8+1 dimensional ethical assessment</w:t>
       </w:r>
     </w:p>
     <w:p>
@@ -387,7 +406,7 @@
         <w:pStyle w:val="Compact"/>
         <w:numPr>
           <w:ilvl w:val="0"/>
-          <w:numId w:val="1002"/>
+          <w:numId w:val="3"/>
         </w:numPr>
       </w:pPr>
       <w:r>
@@ -395,13 +414,10 @@
           <w:b/>
           <w:bCs/>
         </w:rPr>
-        <w:t xml:space="preserve">Bond Index</w:t>
-      </w:r>
-      <w:r>
-        <w:t xml:space="preserve"> </w:t>
-      </w:r>
-      <w:r>
-        <w:t xml:space="preserve">— Measuring deviation from correlative symmetry in normative positions</w:t>
+        <w:t>Bond Index</w:t>
+      </w:r>
+      <w:r>
+        <w:t xml:space="preserve"> — Measuring deviation from correlative symmetry in normative positions</w:t>
       </w:r>
     </w:p>
     <w:p>
@@ -409,7 +425,7 @@
         <w:pStyle w:val="Compact"/>
         <w:numPr>
           <w:ilvl w:val="0"/>
-          <w:numId w:val="1002"/>
+          <w:numId w:val="3"/>
         </w:numPr>
       </w:pPr>
       <w:r>
@@ -417,13 +433,10 @@
           <w:b/>
           <w:bCs/>
         </w:rPr>
-        <w:t xml:space="preserve">Hohfeldian Verdicts</w:t>
-      </w:r>
-      <w:r>
-        <w:t xml:space="preserve"> </w:t>
-      </w:r>
-      <w:r>
-        <w:t xml:space="preserve">— Formal representation of O↔C and L↔N normative relationships</w:t>
+        <w:t>Hohfeldian Verdicts</w:t>
+      </w:r>
+      <w:r>
+        <w:t xml:space="preserve"> — Formal representation of O↔C and L↔N normative relationships</w:t>
       </w:r>
     </w:p>
     <w:p>
@@ -431,7 +444,7 @@
         <w:pStyle w:val="Compact"/>
         <w:numPr>
           <w:ilvl w:val="0"/>
-          <w:numId w:val="1002"/>
+          <w:numId w:val="3"/>
         </w:numPr>
       </w:pPr>
       <w:r>
@@ -439,23 +452,20 @@
           <w:b/>
           <w:bCs/>
         </w:rPr>
-        <w:t xml:space="preserve">DecisionProof</w:t>
-      </w:r>
-      <w:r>
-        <w:t xml:space="preserve"> </w:t>
-      </w:r>
-      <w:r>
-        <w:t xml:space="preserve">— Hash-chained audit trail for governance compliance</w:t>
-      </w:r>
-    </w:p>
-    <w:bookmarkEnd w:id="11"/>
-    <w:bookmarkStart w:id="12" w:name="reference-implementation"/>
+        <w:t>DecisionProof</w:t>
+      </w:r>
+      <w:r>
+        <w:t xml:space="preserve"> — Hash-chained audit trail for governance compliance</w:t>
+      </w:r>
+    </w:p>
     <w:p>
       <w:pPr>
         <w:pStyle w:val="Heading3"/>
       </w:pPr>
-      <w:r>
-        <w:t xml:space="preserve">Reference Implementation</w:t>
+      <w:bookmarkStart w:id="5" w:name="reference-implementation"/>
+      <w:bookmarkEnd w:id="4"/>
+      <w:r>
+        <w:t>Reference Implementation</w:t>
       </w:r>
     </w:p>
     <w:p>
@@ -463,7 +473,7 @@
         <w:pStyle w:val="FirstParagraph"/>
       </w:pPr>
       <w:r>
-        <w:t xml:space="preserve">The Safety Gateway provides:</w:t>
+        <w:t>The Safety Gateway provides:</w:t>
       </w:r>
     </w:p>
     <w:p>
@@ -471,7 +481,7 @@
         <w:pStyle w:val="Compact"/>
         <w:numPr>
           <w:ilvl w:val="0"/>
-          <w:numId w:val="1003"/>
+          <w:numId w:val="4"/>
         </w:numPr>
       </w:pPr>
       <w:r>
@@ -479,10 +489,10 @@
           <w:b/>
           <w:bCs/>
         </w:rPr>
-        <w:t xml:space="preserve">Pre-action checking</w:t>
-      </w:r>
-      <w:r>
-        <w:t xml:space="preserve">: Plans are evaluated before execution begins</w:t>
+        <w:t>Pre-action checking</w:t>
+      </w:r>
+      <w:r>
+        <w:t>: Plans are evaluated before execution begins</w:t>
       </w:r>
     </w:p>
     <w:p>
@@ -490,7 +500,7 @@
         <w:pStyle w:val="Compact"/>
         <w:numPr>
           <w:ilvl w:val="0"/>
-          <w:numId w:val="1003"/>
+          <w:numId w:val="4"/>
         </w:numPr>
       </w:pPr>
       <w:r>
@@ -498,10 +508,10 @@
           <w:b/>
           <w:bCs/>
         </w:rPr>
-        <w:t xml:space="preserve">In-action monitoring</w:t>
-      </w:r>
-      <w:r>
-        <w:t xml:space="preserve">: Real-time safety with sensor integration</w:t>
+        <w:t>In-action monitoring</w:t>
+      </w:r>
+      <w:r>
+        <w:t>: Real-time safety with sensor integration</w:t>
       </w:r>
     </w:p>
     <w:p>
@@ -509,7 +519,7 @@
         <w:pStyle w:val="Compact"/>
         <w:numPr>
           <w:ilvl w:val="0"/>
-          <w:numId w:val="1003"/>
+          <w:numId w:val="4"/>
         </w:numPr>
       </w:pPr>
       <w:r>
@@ -517,10 +527,10 @@
           <w:b/>
           <w:bCs/>
         </w:rPr>
-        <w:t xml:space="preserve">Post-action learning</w:t>
-      </w:r>
-      <w:r>
-        <w:t xml:space="preserve">: Outcomes logged for continuous improvement</w:t>
+        <w:t>Post-action learning</w:t>
+      </w:r>
+      <w:r>
+        <w:t>: Outcomes logged for continuous improvement</w:t>
       </w:r>
     </w:p>
     <w:p>
@@ -528,7 +538,7 @@
         <w:pStyle w:val="Compact"/>
         <w:numPr>
           <w:ilvl w:val="0"/>
-          <w:numId w:val="1003"/>
+          <w:numId w:val="4"/>
         </w:numPr>
       </w:pPr>
       <w:r>
@@ -536,21 +546,21 @@
           <w:b/>
           <w:bCs/>
         </w:rPr>
-        <w:t xml:space="preserve">Graceful degradation</w:t>
-      </w:r>
-      <w:r>
-        <w:t xml:space="preserve">: System remains safe even when ErisML is unavailable</w:t>
-      </w:r>
-    </w:p>
-    <w:bookmarkEnd w:id="12"/>
-    <w:bookmarkEnd w:id="13"/>
-    <w:bookmarkStart w:id="14" w:name="Xbb48e8a5f4d2f984c467ac228d8d5edf6dedbab"/>
+        <w:t>Graceful degradation</w:t>
+      </w:r>
+      <w:r>
+        <w:t>: System remains safe even when ErisML is unavailable</w:t>
+      </w:r>
+    </w:p>
     <w:p>
       <w:pPr>
         <w:pStyle w:val="Heading2"/>
       </w:pPr>
-      <w:r>
-        <w:t xml:space="preserve">The Bond Index: Quantifying Ethical Consistency</w:t>
+      <w:bookmarkStart w:id="6" w:name="Xbb48e8a5f4d2f984c467ac228d8d5edf6dedbab"/>
+      <w:bookmarkEnd w:id="2"/>
+      <w:bookmarkEnd w:id="5"/>
+      <w:r>
+        <w:t>The Bond Index: Quantifying Ethical Consistency</w:t>
       </w:r>
     </w:p>
     <w:p>
@@ -558,20 +568,17 @@
         <w:pStyle w:val="FirstParagraph"/>
       </w:pPr>
       <w:r>
-        <w:t xml:space="preserve">One of the key innovations is the</w:t>
-      </w:r>
-      <w:r>
-        <w:t xml:space="preserve"> </w:t>
-      </w:r>
-      <w:r>
-        <w:rPr>
-          <w:b/>
-          <w:bCs/>
-        </w:rPr>
-        <w:t xml:space="preserve">Bond Index</w:t>
-      </w:r>
-      <w:r>
-        <w:t xml:space="preserve">—a quantitative measure of ethical consistency based on Hohfeldian correlative symmetry.</w:t>
+        <w:t xml:space="preserve">One of the key innovations is the </w:t>
+      </w:r>
+      <w:r>
+        <w:rPr>
+          <w:b/>
+          <w:bCs/>
+        </w:rPr>
+        <w:t>Bond Index</w:t>
+      </w:r>
+      <w:r>
+        <w:t>—a quantitative measure of ethical consistency based on Hohfeldian correlative symmetry.</w:t>
       </w:r>
     </w:p>
     <w:p>
@@ -579,45 +586,27 @@
         <w:pStyle w:val="BodyText"/>
       </w:pPr>
       <w:r>
-        <w:t xml:space="preserve">In Hohfeldian analysis, normative positions come in correlative pairs:</w:t>
-      </w:r>
-      <w:r>
-        <w:t xml:space="preserve"> </w:t>
-      </w:r>
-      <w:r>
-        <w:t xml:space="preserve">-</w:t>
-      </w:r>
-      <w:r>
-        <w:t xml:space="preserve"> </w:t>
-      </w:r>
-      <w:r>
-        <w:rPr>
-          <w:b/>
-          <w:bCs/>
-        </w:rPr>
-        <w:t xml:space="preserve">Obligation ↔ Claim</w:t>
-      </w:r>
-      <w:r>
-        <w:t xml:space="preserve">: If I have an obligation to you, you have a claim against me</w:t>
-      </w:r>
-      <w:r>
-        <w:t xml:space="preserve"> </w:t>
-      </w:r>
-      <w:r>
-        <w:t xml:space="preserve">-</w:t>
-      </w:r>
-      <w:r>
-        <w:t xml:space="preserve"> </w:t>
-      </w:r>
-      <w:r>
-        <w:rPr>
-          <w:b/>
-          <w:bCs/>
-        </w:rPr>
-        <w:t xml:space="preserve">Liberty ↔ No-claim</w:t>
-      </w:r>
-      <w:r>
-        <w:t xml:space="preserve">: If I have liberty to act, you have no claim to stop me</w:t>
+        <w:t xml:space="preserve">In Hohfeldian analysis, normative positions come in correlative pairs: - </w:t>
+      </w:r>
+      <w:r>
+        <w:rPr>
+          <w:b/>
+          <w:bCs/>
+        </w:rPr>
+        <w:t>Obligation ↔ Claim</w:t>
+      </w:r>
+      <w:r>
+        <w:t xml:space="preserve">: If I have an obligation to you, you have a claim against me - </w:t>
+      </w:r>
+      <w:r>
+        <w:rPr>
+          <w:b/>
+          <w:bCs/>
+        </w:rPr>
+        <w:t>Liberty ↔ No-claim</w:t>
+      </w:r>
+      <w:r>
+        <w:t>: If I have liberty to act, you have no claim to stop me</w:t>
       </w:r>
     </w:p>
     <w:p>
@@ -625,138 +614,193 @@
         <w:pStyle w:val="BodyText"/>
       </w:pPr>
       <w:r>
-        <w:t xml:space="preserve">The Bond Index measures how well ethical judgments maintain these symmetries:</w:t>
+        <w:t>The Bond Index measures how well ethical judgments maintain these symmetries:</w:t>
       </w:r>
     </w:p>
     <w:tbl>
       <w:tblPr>
         <w:tblStyle w:val="Table"/>
-        <w:tblW w:type="auto" w:w="0"/>
-        <w:tblLook w:firstRow="1" w:lastRow="0" w:firstColumn="0" w:lastColumn="0" w:noHBand="0" w:noVBand="0" w:val="0020"/>
+        <w:tblW w:w="0" w:type="auto"/>
+        <w:tblLook w:val="0020" w:firstRow="1" w:lastRow="0" w:firstColumn="0" w:lastColumn="0" w:noHBand="0" w:noVBand="0"/>
       </w:tblPr>
       <w:tblGrid>
-        <w:gridCol w:w="3960"/>
-        <w:gridCol w:w="3960"/>
+        <w:gridCol w:w="1371"/>
+        <w:gridCol w:w="4162"/>
       </w:tblGrid>
       <w:tr>
         <w:trPr>
-          <w:tblHeader w:val="on"/>
+          <w:cnfStyle w:val="100000000000" w:firstRow="1" w:lastRow="0" w:firstColumn="0" w:lastColumn="0" w:oddVBand="0" w:evenVBand="0" w:oddHBand="0" w:evenHBand="0" w:firstRowFirstColumn="0" w:firstRowLastColumn="0" w:lastRowFirstColumn="0" w:lastRowLastColumn="0"/>
+          <w:tblHeader/>
         </w:trPr>
         <w:tc>
-          <w:tcPr/>
+          <w:tcPr>
+            <w:tcW w:w="0" w:type="auto"/>
+            <w:tcBorders>
+              <w:top w:val="single" w:sz="4" w:space="0" w:color="auto"/>
+              <w:left w:val="single" w:sz="4" w:space="0" w:color="auto"/>
+            </w:tcBorders>
+          </w:tcPr>
           <w:p>
             <w:pPr>
               <w:pStyle w:val="Compact"/>
             </w:pPr>
             <w:r>
-              <w:t xml:space="preserve">Bond Index</w:t>
+              <w:t>Bond Index</w:t>
             </w:r>
           </w:p>
         </w:tc>
         <w:tc>
-          <w:tcPr/>
+          <w:tcPr>
+            <w:tcW w:w="0" w:type="auto"/>
+            <w:tcBorders>
+              <w:top w:val="single" w:sz="4" w:space="0" w:color="auto"/>
+              <w:right w:val="single" w:sz="4" w:space="0" w:color="auto"/>
+            </w:tcBorders>
+          </w:tcPr>
           <w:p>
             <w:pPr>
               <w:pStyle w:val="Compact"/>
             </w:pPr>
             <w:r>
-              <w:t xml:space="preserve">Interpretation</w:t>
+              <w:t>Interpretation</w:t>
             </w:r>
           </w:p>
         </w:tc>
       </w:tr>
       <w:tr>
         <w:tc>
-          <w:tcPr/>
+          <w:tcPr>
+            <w:tcW w:w="0" w:type="auto"/>
+            <w:tcBorders>
+              <w:left w:val="single" w:sz="4" w:space="0" w:color="auto"/>
+            </w:tcBorders>
+          </w:tcPr>
           <w:p>
             <w:pPr>
               <w:pStyle w:val="Compact"/>
             </w:pPr>
             <w:r>
-              <w:t xml:space="preserve">0.00</w:t>
+              <w:t>0.00</w:t>
             </w:r>
           </w:p>
         </w:tc>
         <w:tc>
-          <w:tcPr/>
+          <w:tcPr>
+            <w:tcW w:w="0" w:type="auto"/>
+            <w:tcBorders>
+              <w:right w:val="single" w:sz="4" w:space="0" w:color="auto"/>
+            </w:tcBorders>
+          </w:tcPr>
           <w:p>
             <w:pPr>
               <w:pStyle w:val="Compact"/>
             </w:pPr>
             <w:r>
-              <w:t xml:space="preserve">Perfect symmetry (ideal)</w:t>
+              <w:t>Perfect symmetry (ideal)</w:t>
             </w:r>
           </w:p>
         </w:tc>
       </w:tr>
       <w:tr>
         <w:tc>
-          <w:tcPr/>
+          <w:tcPr>
+            <w:tcW w:w="0" w:type="auto"/>
+            <w:tcBorders>
+              <w:left w:val="single" w:sz="4" w:space="0" w:color="auto"/>
+            </w:tcBorders>
+          </w:tcPr>
           <w:p>
             <w:pPr>
               <w:pStyle w:val="Compact"/>
             </w:pPr>
             <w:r>
-              <w:t xml:space="preserve">0.155</w:t>
+              <w:t>0.155</w:t>
             </w:r>
           </w:p>
         </w:tc>
         <w:tc>
-          <w:tcPr/>
+          <w:tcPr>
+            <w:tcW w:w="0" w:type="auto"/>
+            <w:tcBorders>
+              <w:right w:val="single" w:sz="4" w:space="0" w:color="auto"/>
+            </w:tcBorders>
+          </w:tcPr>
           <w:p>
             <w:pPr>
               <w:pStyle w:val="Compact"/>
             </w:pPr>
             <w:r>
-              <w:t xml:space="preserve">Empirical baseline (Dear Abby corpus)</w:t>
+              <w:t>Empirical baseline (Dear Abby corpus)</w:t>
             </w:r>
           </w:p>
         </w:tc>
       </w:tr>
       <w:tr>
         <w:tc>
-          <w:tcPr/>
+          <w:tcPr>
+            <w:tcW w:w="0" w:type="auto"/>
+            <w:tcBorders>
+              <w:left w:val="single" w:sz="4" w:space="0" w:color="auto"/>
+            </w:tcBorders>
+          </w:tcPr>
           <w:p>
             <w:pPr>
               <w:pStyle w:val="Compact"/>
             </w:pPr>
             <w:r>
-              <w:t xml:space="preserve">0.25</w:t>
+              <w:t>0.25</w:t>
             </w:r>
           </w:p>
         </w:tc>
         <w:tc>
-          <w:tcPr/>
+          <w:tcPr>
+            <w:tcW w:w="0" w:type="auto"/>
+            <w:tcBorders>
+              <w:right w:val="single" w:sz="4" w:space="0" w:color="auto"/>
+            </w:tcBorders>
+          </w:tcPr>
           <w:p>
             <w:pPr>
               <w:pStyle w:val="Compact"/>
             </w:pPr>
             <w:r>
-              <w:t xml:space="preserve">Warning threshold</w:t>
+              <w:t>Warning threshold</w:t>
             </w:r>
           </w:p>
         </w:tc>
       </w:tr>
       <w:tr>
         <w:tc>
-          <w:tcPr/>
+          <w:tcPr>
+            <w:tcW w:w="0" w:type="auto"/>
+            <w:tcBorders>
+              <w:left w:val="single" w:sz="4" w:space="0" w:color="auto"/>
+              <w:bottom w:val="single" w:sz="4" w:space="0" w:color="auto"/>
+            </w:tcBorders>
+          </w:tcPr>
           <w:p>
             <w:pPr>
               <w:pStyle w:val="Compact"/>
             </w:pPr>
             <w:r>
-              <w:t xml:space="preserve">0.30</w:t>
+              <w:t>0.30</w:t>
             </w:r>
           </w:p>
         </w:tc>
         <w:tc>
-          <w:tcPr/>
+          <w:tcPr>
+            <w:tcW w:w="0" w:type="auto"/>
+            <w:tcBorders>
+              <w:bottom w:val="single" w:sz="4" w:space="0" w:color="auto"/>
+              <w:right w:val="single" w:sz="4" w:space="0" w:color="auto"/>
+            </w:tcBorders>
+          </w:tcPr>
           <w:p>
             <w:pPr>
               <w:pStyle w:val="Compact"/>
             </w:pPr>
             <w:r>
-              <w:t xml:space="preserve">Block threshold</w:t>
+              <w:t>Block threshold</w:t>
             </w:r>
           </w:p>
         </w:tc>
@@ -767,17 +811,18 @@
         <w:pStyle w:val="BodyText"/>
       </w:pPr>
       <w:r>
-        <w:t xml:space="preserve">This gives us a mathematically grounded metric that the system can optimize toward—validated empirically across 20,000+ ethical scenarios including cross-temporal analysis of texts spanning 700 years.</w:t>
-      </w:r>
-    </w:p>
-    <w:bookmarkEnd w:id="14"/>
-    <w:bookmarkStart w:id="15" w:name="the-81-moral-vector"/>
+        <w:t>This gives us a mathematically grounded metric that the system can optimize toward—validated empirically across 20,000+ ethical scenarios including cross-temporal analysis of texts spanning 700 years.</w:t>
+      </w:r>
+    </w:p>
     <w:p>
       <w:pPr>
         <w:pStyle w:val="Heading2"/>
       </w:pPr>
-      <w:r>
-        <w:t xml:space="preserve">The 8+1 Moral Vector</w:t>
+      <w:bookmarkStart w:id="7" w:name="the-81-moral-vector"/>
+      <w:bookmarkEnd w:id="6"/>
+      <w:r>
+        <w:lastRenderedPageBreak/>
+        <w:t>The 8+1 Moral Vector</w:t>
       </w:r>
     </w:p>
     <w:p>
@@ -785,7 +830,7 @@
         <w:pStyle w:val="FirstParagraph"/>
       </w:pPr>
       <w:r>
-        <w:t xml:space="preserve">Every action is evaluated across eight ethical dimensions, plus epistemic quality:</w:t>
+        <w:t>Every action is evaluated across eight ethical dimensions, plus epistemic quality:</w:t>
       </w:r>
     </w:p>
     <w:p>
@@ -793,7 +838,7 @@
         <w:pStyle w:val="Compact"/>
         <w:numPr>
           <w:ilvl w:val="0"/>
-          <w:numId w:val="1004"/>
+          <w:numId w:val="5"/>
         </w:numPr>
       </w:pPr>
       <w:r>
@@ -801,13 +846,10 @@
           <w:b/>
           <w:bCs/>
         </w:rPr>
-        <w:t xml:space="preserve">Physical Harm</w:t>
-      </w:r>
-      <w:r>
-        <w:t xml:space="preserve"> </w:t>
-      </w:r>
-      <w:r>
-        <w:t xml:space="preserve">— Risk of bodily harm</w:t>
+        <w:t>Physical Harm</w:t>
+      </w:r>
+      <w:r>
+        <w:t xml:space="preserve"> — Risk of bodily harm</w:t>
       </w:r>
     </w:p>
     <w:p>
@@ -815,7 +857,7 @@
         <w:pStyle w:val="Compact"/>
         <w:numPr>
           <w:ilvl w:val="0"/>
-          <w:numId w:val="1004"/>
+          <w:numId w:val="5"/>
         </w:numPr>
       </w:pPr>
       <w:r>
@@ -823,13 +865,10 @@
           <w:b/>
           <w:bCs/>
         </w:rPr>
-        <w:t xml:space="preserve">Rights Respect</w:t>
-      </w:r>
-      <w:r>
-        <w:t xml:space="preserve"> </w:t>
-      </w:r>
-      <w:r>
-        <w:t xml:space="preserve">— Adherence to fundamental rights</w:t>
+        <w:t>Rights Respect</w:t>
+      </w:r>
+      <w:r>
+        <w:t xml:space="preserve"> — Adherence to fundamental rights</w:t>
       </w:r>
     </w:p>
     <w:p>
@@ -837,7 +876,7 @@
         <w:pStyle w:val="Compact"/>
         <w:numPr>
           <w:ilvl w:val="0"/>
-          <w:numId w:val="1004"/>
+          <w:numId w:val="5"/>
         </w:numPr>
       </w:pPr>
       <w:r>
@@ -845,13 +884,10 @@
           <w:b/>
           <w:bCs/>
         </w:rPr>
-        <w:t xml:space="preserve">Fairness &amp; Equity</w:t>
-      </w:r>
-      <w:r>
-        <w:t xml:space="preserve"> </w:t>
-      </w:r>
-      <w:r>
-        <w:t xml:space="preserve">— Distributive justice</w:t>
+        <w:t>Fairness &amp; Equity</w:t>
+      </w:r>
+      <w:r>
+        <w:t xml:space="preserve"> — Distributive justice</w:t>
       </w:r>
     </w:p>
     <w:p>
@@ -859,7 +895,7 @@
         <w:pStyle w:val="Compact"/>
         <w:numPr>
           <w:ilvl w:val="0"/>
-          <w:numId w:val="1004"/>
+          <w:numId w:val="5"/>
         </w:numPr>
       </w:pPr>
       <w:r>
@@ -867,13 +903,10 @@
           <w:b/>
           <w:bCs/>
         </w:rPr>
-        <w:t xml:space="preserve">Autonomy Respect</w:t>
-      </w:r>
-      <w:r>
-        <w:t xml:space="preserve"> </w:t>
-      </w:r>
-      <w:r>
-        <w:t xml:space="preserve">— Honoring agent self-determination</w:t>
+        <w:t>Autonomy Respect</w:t>
+      </w:r>
+      <w:r>
+        <w:t xml:space="preserve"> — Honoring agent self-determination</w:t>
       </w:r>
     </w:p>
     <w:p>
@@ -881,7 +914,7 @@
         <w:pStyle w:val="Compact"/>
         <w:numPr>
           <w:ilvl w:val="0"/>
-          <w:numId w:val="1004"/>
+          <w:numId w:val="5"/>
         </w:numPr>
       </w:pPr>
       <w:r>
@@ -889,13 +922,10 @@
           <w:b/>
           <w:bCs/>
         </w:rPr>
-        <w:t xml:space="preserve">Privacy Protection</w:t>
-      </w:r>
-      <w:r>
-        <w:t xml:space="preserve"> </w:t>
-      </w:r>
-      <w:r>
-        <w:t xml:space="preserve">— Information boundaries</w:t>
+        <w:t>Privacy Protection</w:t>
+      </w:r>
+      <w:r>
+        <w:t xml:space="preserve"> — Information boundaries</w:t>
       </w:r>
     </w:p>
     <w:p>
@@ -903,7 +933,7 @@
         <w:pStyle w:val="Compact"/>
         <w:numPr>
           <w:ilvl w:val="0"/>
-          <w:numId w:val="1004"/>
+          <w:numId w:val="5"/>
         </w:numPr>
       </w:pPr>
       <w:r>
@@ -911,13 +941,10 @@
           <w:b/>
           <w:bCs/>
         </w:rPr>
-        <w:t xml:space="preserve">Societal Impact</w:t>
-      </w:r>
-      <w:r>
-        <w:t xml:space="preserve"> </w:t>
-      </w:r>
-      <w:r>
-        <w:t xml:space="preserve">— Broader consequences</w:t>
+        <w:t>Societal Impact</w:t>
+      </w:r>
+      <w:r>
+        <w:t xml:space="preserve"> — Broader consequences</w:t>
       </w:r>
     </w:p>
     <w:p>
@@ -925,7 +952,7 @@
         <w:pStyle w:val="Compact"/>
         <w:numPr>
           <w:ilvl w:val="0"/>
-          <w:numId w:val="1004"/>
+          <w:numId w:val="5"/>
         </w:numPr>
       </w:pPr>
       <w:r>
@@ -933,13 +960,10 @@
           <w:b/>
           <w:bCs/>
         </w:rPr>
-        <w:t xml:space="preserve">Virtue &amp; Care</w:t>
-      </w:r>
-      <w:r>
-        <w:t xml:space="preserve"> </w:t>
-      </w:r>
-      <w:r>
-        <w:t xml:space="preserve">— Character-based considerations</w:t>
+        <w:t>Virtue &amp; Care</w:t>
+      </w:r>
+      <w:r>
+        <w:t xml:space="preserve"> — Character-based considerations</w:t>
       </w:r>
     </w:p>
     <w:p>
@@ -947,7 +971,7 @@
         <w:pStyle w:val="Compact"/>
         <w:numPr>
           <w:ilvl w:val="0"/>
-          <w:numId w:val="1004"/>
+          <w:numId w:val="5"/>
         </w:numPr>
       </w:pPr>
       <w:r>
@@ -955,13 +979,10 @@
           <w:b/>
           <w:bCs/>
         </w:rPr>
-        <w:t xml:space="preserve">Legitimacy &amp; Trust</w:t>
-      </w:r>
-      <w:r>
-        <w:t xml:space="preserve"> </w:t>
-      </w:r>
-      <w:r>
-        <w:t xml:space="preserve">— Procedural validity</w:t>
+        <w:t>Legitimacy &amp; Trust</w:t>
+      </w:r>
+      <w:r>
+        <w:t xml:space="preserve"> — Procedural validity</w:t>
       </w:r>
     </w:p>
     <w:p>
@@ -969,7 +990,7 @@
         <w:pStyle w:val="Compact"/>
         <w:numPr>
           <w:ilvl w:val="0"/>
-          <w:numId w:val="1004"/>
+          <w:numId w:val="5"/>
         </w:numPr>
       </w:pPr>
       <w:r>
@@ -977,13 +998,10 @@
           <w:b/>
           <w:bCs/>
         </w:rPr>
-        <w:t xml:space="preserve">Epistemic Quality</w:t>
-      </w:r>
-      <w:r>
-        <w:t xml:space="preserve"> </w:t>
-      </w:r>
-      <w:r>
-        <w:t xml:space="preserve">— Confidence in the assessment itself</w:t>
+        <w:t>Epistemic Quality</w:t>
+      </w:r>
+      <w:r>
+        <w:t xml:space="preserve"> — Confidence in the assessment itself</w:t>
       </w:r>
     </w:p>
     <w:p>
@@ -991,26 +1009,26 @@
         <w:pStyle w:val="FirstParagraph"/>
       </w:pPr>
       <w:r>
-        <w:t xml:space="preserve">This multi-dimensional approach avoids the trap of reducing ethics to a single score while still enabling computational tractability.</w:t>
-      </w:r>
-    </w:p>
-    <w:bookmarkEnd w:id="15"/>
-    <w:bookmarkStart w:id="19" w:name="why-this-matters"/>
+        <w:t>This multi-dimensional approach avoids the trap of reducing ethics to a single score while still enabling computational tractability.</w:t>
+      </w:r>
+    </w:p>
     <w:p>
       <w:pPr>
         <w:pStyle w:val="Heading2"/>
       </w:pPr>
-      <w:r>
-        <w:t xml:space="preserve">Why This Matters</w:t>
-      </w:r>
-    </w:p>
-    <w:bookmarkStart w:id="16" w:name="for-agi-safety"/>
+      <w:bookmarkStart w:id="8" w:name="why-this-matters"/>
+      <w:bookmarkEnd w:id="7"/>
+      <w:r>
+        <w:t>Why This Matters</w:t>
+      </w:r>
+    </w:p>
     <w:p>
       <w:pPr>
         <w:pStyle w:val="Heading3"/>
       </w:pPr>
-      <w:r>
-        <w:t xml:space="preserve">For AGI Safety</w:t>
+      <w:bookmarkStart w:id="9" w:name="for-agi-safety"/>
+      <w:r>
+        <w:t>For AGI Safety</w:t>
       </w:r>
     </w:p>
     <w:p>
@@ -1018,7 +1036,7 @@
         <w:pStyle w:val="FirstParagraph"/>
       </w:pPr>
       <w:r>
-        <w:t xml:space="preserve">Traditional AI alignment focuses on reward functions and constitutional AI. Our approach adds:</w:t>
+        <w:t>Traditional AI alignment focuses on reward functions and constitutional AI. Our approach adds:</w:t>
       </w:r>
     </w:p>
     <w:p>
@@ -1026,7 +1044,7 @@
         <w:pStyle w:val="Compact"/>
         <w:numPr>
           <w:ilvl w:val="0"/>
-          <w:numId w:val="1005"/>
+          <w:numId w:val="6"/>
         </w:numPr>
       </w:pPr>
       <w:r>
@@ -1034,13 +1052,10 @@
           <w:b/>
           <w:bCs/>
         </w:rPr>
-        <w:t xml:space="preserve">Formal verification</w:t>
-      </w:r>
-      <w:r>
-        <w:t xml:space="preserve"> </w:t>
-      </w:r>
-      <w:r>
-        <w:t xml:space="preserve">of ethical properties</w:t>
+        <w:t>Formal verification</w:t>
+      </w:r>
+      <w:r>
+        <w:t xml:space="preserve"> of ethical properties</w:t>
       </w:r>
     </w:p>
     <w:p>
@@ -1048,7 +1063,7 @@
         <w:pStyle w:val="Compact"/>
         <w:numPr>
           <w:ilvl w:val="0"/>
-          <w:numId w:val="1005"/>
+          <w:numId w:val="6"/>
         </w:numPr>
       </w:pPr>
       <w:r>
@@ -1056,13 +1071,10 @@
           <w:b/>
           <w:bCs/>
         </w:rPr>
-        <w:t xml:space="preserve">Auditable decision trails</w:t>
-      </w:r>
-      <w:r>
-        <w:t xml:space="preserve"> </w:t>
-      </w:r>
-      <w:r>
-        <w:t xml:space="preserve">with cryptographic proofs</w:t>
+        <w:t>Auditable decision trails</w:t>
+      </w:r>
+      <w:r>
+        <w:t xml:space="preserve"> with cryptographic proofs</w:t>
       </w:r>
     </w:p>
     <w:p>
@@ -1070,7 +1082,7 @@
         <w:pStyle w:val="Compact"/>
         <w:numPr>
           <w:ilvl w:val="0"/>
-          <w:numId w:val="1005"/>
+          <w:numId w:val="6"/>
         </w:numPr>
       </w:pPr>
       <w:r>
@@ -1078,13 +1090,10 @@
           <w:b/>
           <w:bCs/>
         </w:rPr>
-        <w:t xml:space="preserve">Quantitative metrics</w:t>
-      </w:r>
-      <w:r>
-        <w:t xml:space="preserve"> </w:t>
-      </w:r>
-      <w:r>
-        <w:t xml:space="preserve">grounded in moral philosophy</w:t>
+        <w:t>Quantitative metrics</w:t>
+      </w:r>
+      <w:r>
+        <w:t xml:space="preserve"> grounded in moral philosophy</w:t>
       </w:r>
     </w:p>
     <w:p>
@@ -1092,7 +1101,7 @@
         <w:pStyle w:val="Compact"/>
         <w:numPr>
           <w:ilvl w:val="0"/>
-          <w:numId w:val="1005"/>
+          <w:numId w:val="6"/>
         </w:numPr>
       </w:pPr>
       <w:r>
@@ -1100,23 +1109,20 @@
           <w:b/>
           <w:bCs/>
         </w:rPr>
-        <w:t xml:space="preserve">Graceful degradation</w:t>
-      </w:r>
-      <w:r>
-        <w:t xml:space="preserve"> </w:t>
-      </w:r>
-      <w:r>
-        <w:t xml:space="preserve">under uncertainty</w:t>
-      </w:r>
-    </w:p>
-    <w:bookmarkEnd w:id="16"/>
-    <w:bookmarkStart w:id="17" w:name="for-embodied-ai"/>
+        <w:t>Graceful degradation</w:t>
+      </w:r>
+      <w:r>
+        <w:t xml:space="preserve"> under uncertainty</w:t>
+      </w:r>
+    </w:p>
     <w:p>
       <w:pPr>
         <w:pStyle w:val="Heading3"/>
       </w:pPr>
-      <w:r>
-        <w:t xml:space="preserve">For Embodied AI</w:t>
+      <w:bookmarkStart w:id="10" w:name="for-embodied-ai"/>
+      <w:bookmarkEnd w:id="9"/>
+      <w:r>
+        <w:t>For Embodied AI</w:t>
       </w:r>
     </w:p>
     <w:p>
@@ -1124,7 +1130,7 @@
         <w:pStyle w:val="FirstParagraph"/>
       </w:pPr>
       <w:r>
-        <w:t xml:space="preserve">Robots and physical AI systems face real-time safety constraints that language models don’t. Our three-layer architecture provides:</w:t>
+        <w:t>Robots and physical AI systems face real-time safety constraints that language models don’t. Our three-layer architecture provides:</w:t>
       </w:r>
     </w:p>
     <w:p>
@@ -1132,11 +1138,11 @@
         <w:pStyle w:val="Compact"/>
         <w:numPr>
           <w:ilvl w:val="0"/>
-          <w:numId w:val="1006"/>
+          <w:numId w:val="7"/>
         </w:numPr>
       </w:pPr>
       <w:r>
-        <w:t xml:space="preserve">Sub-millisecond reflex responses for collision avoidance</w:t>
+        <w:t>Sub-millisecond reflex responses for collision avoidance</w:t>
       </w:r>
     </w:p>
     <w:p>
@@ -1144,11 +1150,11 @@
         <w:pStyle w:val="Compact"/>
         <w:numPr>
           <w:ilvl w:val="0"/>
-          <w:numId w:val="1006"/>
+          <w:numId w:val="7"/>
         </w:numPr>
       </w:pPr>
       <w:r>
-        <w:t xml:space="preserve">Thoughtful ethical evaluation for complex decisions</w:t>
+        <w:t>Thoughtful ethical evaluation for complex decisions</w:t>
       </w:r>
     </w:p>
     <w:p>
@@ -1156,21 +1162,21 @@
         <w:pStyle w:val="Compact"/>
         <w:numPr>
           <w:ilvl w:val="0"/>
-          <w:numId w:val="1006"/>
+          <w:numId w:val="7"/>
         </w:numPr>
       </w:pPr>
       <w:r>
-        <w:t xml:space="preserve">Human oversight hooks for novel situations</w:t>
-      </w:r>
-    </w:p>
-    <w:bookmarkEnd w:id="17"/>
-    <w:bookmarkStart w:id="18" w:name="for-governance"/>
+        <w:t>Human oversight hooks for novel situations</w:t>
+      </w:r>
+    </w:p>
     <w:p>
       <w:pPr>
         <w:pStyle w:val="Heading3"/>
       </w:pPr>
-      <w:r>
-        <w:t xml:space="preserve">For Governance</w:t>
+      <w:bookmarkStart w:id="11" w:name="for-governance"/>
+      <w:bookmarkEnd w:id="10"/>
+      <w:r>
+        <w:t>For Governance</w:t>
       </w:r>
     </w:p>
     <w:p>
@@ -1178,7 +1184,7 @@
         <w:pStyle w:val="FirstParagraph"/>
       </w:pPr>
       <w:r>
-        <w:t xml:space="preserve">The hash-chained DecisionProof system creates an immutable audit trail:</w:t>
+        <w:t>The hash-chained DecisionProof system creates an immutable audit trail:</w:t>
       </w:r>
     </w:p>
     <w:p>
@@ -1189,7 +1195,7 @@
         <w:rPr>
           <w:rStyle w:val="VerbatimChar"/>
         </w:rPr>
-        <w:t xml:space="preserve">Decision → Hash → Next Decision → Hash → ...</w:t>
+        <w:t>Decision → Hash → Next Decision → Hash → ...</w:t>
       </w:r>
     </w:p>
     <w:p>
@@ -1197,18 +1203,19 @@
         <w:pStyle w:val="FirstParagraph"/>
       </w:pPr>
       <w:r>
-        <w:t xml:space="preserve">This enables post-hoc analysis of why the system made particular choices—essential for regulatory compliance and public trust.</w:t>
-      </w:r>
-    </w:p>
-    <w:bookmarkEnd w:id="18"/>
-    <w:bookmarkEnd w:id="19"/>
-    <w:bookmarkStart w:id="20" w:name="the-bigger-picture"/>
+        <w:t>This enables post-hoc analysis of why the system made particular choices—essential for regulatory compliance and public trust.</w:t>
+      </w:r>
+    </w:p>
     <w:p>
       <w:pPr>
         <w:pStyle w:val="Heading2"/>
       </w:pPr>
-      <w:r>
-        <w:t xml:space="preserve">The Bigger Picture</w:t>
+      <w:bookmarkStart w:id="12" w:name="the-bigger-picture"/>
+      <w:bookmarkEnd w:id="8"/>
+      <w:bookmarkEnd w:id="11"/>
+      <w:r>
+        <w:lastRenderedPageBreak/>
+        <w:t>The Bigger Picture</w:t>
       </w:r>
     </w:p>
     <w:p>
@@ -1216,7 +1223,7 @@
         <w:pStyle w:val="FirstParagraph"/>
       </w:pPr>
       <w:r>
-        <w:t xml:space="preserve">This integration is part of a larger research program:</w:t>
+        <w:t>This integration is part of a larger research program:</w:t>
       </w:r>
     </w:p>
     <w:p>
@@ -1227,7 +1234,7 @@
         <w:rPr>
           <w:rStyle w:val="VerbatimChar"/>
         </w:rPr>
-        <w:t xml:space="preserve">sqnd-probe          →  Empirical ethics validation</w:t>
+        <w:t>sqnd-probe          →  Empirical ethics validation</w:t>
       </w:r>
       <w:r>
         <w:br/>
@@ -1245,7 +1252,7 @@
         <w:rPr>
           <w:rStyle w:val="VerbatimChar"/>
         </w:rPr>
-        <w:t xml:space="preserve">erisml-lib          →  Safety framework (Bond Index, DEME, Hohfeldian)</w:t>
+        <w:t>erisml-lib          →  Safety framework (Bond Index, DEME, Hohfeldian)</w:t>
       </w:r>
       <w:r>
         <w:br/>
@@ -1263,7 +1270,7 @@
         <w:rPr>
           <w:rStyle w:val="VerbatimChar"/>
         </w:rPr>
-        <w:t xml:space="preserve">agi-hpc             →  Cognitive architecture (this integration)</w:t>
+        <w:t>agi-hpc             →  Cognitive architecture (this integration)</w:t>
       </w:r>
     </w:p>
     <w:p>
@@ -1271,17 +1278,17 @@
         <w:pStyle w:val="FirstParagraph"/>
       </w:pPr>
       <w:r>
-        <w:t xml:space="preserve">The empirical research validates the theoretical framework, which then gets operationalized in the cognitive architecture. Each layer informs the others.</w:t>
-      </w:r>
-    </w:p>
-    <w:bookmarkEnd w:id="20"/>
-    <w:bookmarkStart w:id="21" w:name="whats-next"/>
+        <w:t>The empirical research validates the theoretical framework, which then gets operationalized in the cognitive architecture. Each layer informs the others.</w:t>
+      </w:r>
+    </w:p>
     <w:p>
       <w:pPr>
         <w:pStyle w:val="Heading2"/>
       </w:pPr>
-      <w:r>
-        <w:t xml:space="preserve">What’s Next</w:t>
+      <w:bookmarkStart w:id="13" w:name="whats-next"/>
+      <w:bookmarkEnd w:id="12"/>
+      <w:r>
+        <w:t>What’s Next</w:t>
       </w:r>
     </w:p>
     <w:p>
@@ -1289,7 +1296,7 @@
         <w:pStyle w:val="Compact"/>
         <w:numPr>
           <w:ilvl w:val="0"/>
-          <w:numId w:val="1007"/>
+          <w:numId w:val="8"/>
         </w:numPr>
       </w:pPr>
       <w:r>
@@ -1297,13 +1304,10 @@
           <w:b/>
           <w:bCs/>
         </w:rPr>
-        <w:t xml:space="preserve">Service implementation</w:t>
-      </w:r>
-      <w:r>
-        <w:t xml:space="preserve"> </w:t>
-      </w:r>
-      <w:r>
-        <w:t xml:space="preserve">connecting ErisML’s full DEME pipeline</w:t>
+        <w:t>Service implementation</w:t>
+      </w:r>
+      <w:r>
+        <w:t xml:space="preserve"> connecting ErisML’s full DEME pipeline</w:t>
       </w:r>
     </w:p>
     <w:p>
@@ -1311,7 +1315,7 @@
         <w:pStyle w:val="Compact"/>
         <w:numPr>
           <w:ilvl w:val="0"/>
-          <w:numId w:val="1007"/>
+          <w:numId w:val="8"/>
         </w:numPr>
       </w:pPr>
       <w:r>
@@ -1319,13 +1323,10 @@
           <w:b/>
           <w:bCs/>
         </w:rPr>
-        <w:t xml:space="preserve">DEME profile tuning</w:t>
-      </w:r>
-      <w:r>
-        <w:t xml:space="preserve"> </w:t>
-      </w:r>
-      <w:r>
-        <w:t xml:space="preserve">for embodied robotics domains</w:t>
+        <w:t>DEME profile tuning</w:t>
+      </w:r>
+      <w:r>
+        <w:t xml:space="preserve"> for embodied robotics domains</w:t>
       </w:r>
     </w:p>
     <w:p>
@@ -1333,7 +1334,7 @@
         <w:pStyle w:val="Compact"/>
         <w:numPr>
           <w:ilvl w:val="0"/>
-          <w:numId w:val="1007"/>
+          <w:numId w:val="8"/>
         </w:numPr>
       </w:pPr>
       <w:r>
@@ -1341,13 +1342,10 @@
           <w:b/>
           <w:bCs/>
         </w:rPr>
-        <w:t xml:space="preserve">Episodic memory integration</w:t>
-      </w:r>
-      <w:r>
-        <w:t xml:space="preserve"> </w:t>
-      </w:r>
-      <w:r>
-        <w:t xml:space="preserve">for learning from ethical outcomes</w:t>
+        <w:t>Episodic memory integration</w:t>
+      </w:r>
+      <w:r>
+        <w:t xml:space="preserve"> for learning from ethical outcomes</w:t>
       </w:r>
     </w:p>
     <w:p>
@@ -1355,7 +1353,7 @@
         <w:pStyle w:val="Compact"/>
         <w:numPr>
           <w:ilvl w:val="0"/>
-          <w:numId w:val="1007"/>
+          <w:numId w:val="8"/>
         </w:numPr>
       </w:pPr>
       <w:r>
@@ -1363,23 +1361,20 @@
           <w:b/>
           <w:bCs/>
         </w:rPr>
-        <w:t xml:space="preserve">Multi-agent coordination</w:t>
-      </w:r>
-      <w:r>
-        <w:t xml:space="preserve"> </w:t>
-      </w:r>
-      <w:r>
-        <w:t xml:space="preserve">with shared ethical constraints</w:t>
-      </w:r>
-    </w:p>
-    <w:bookmarkEnd w:id="21"/>
-    <w:bookmarkStart w:id="22" w:name="try-it-yourself"/>
+        <w:t>Multi-agent coordination</w:t>
+      </w:r>
+      <w:r>
+        <w:t xml:space="preserve"> with shared ethical constraints</w:t>
+      </w:r>
+    </w:p>
     <w:p>
       <w:pPr>
         <w:pStyle w:val="Heading2"/>
       </w:pPr>
-      <w:r>
-        <w:t xml:space="preserve">Try It Yourself</w:t>
+      <w:bookmarkStart w:id="14" w:name="try-it-yourself"/>
+      <w:bookmarkEnd w:id="13"/>
+      <w:r>
+        <w:t>Try It Yourself</w:t>
       </w:r>
     </w:p>
     <w:p>
@@ -1387,7 +1382,7 @@
         <w:pStyle w:val="FirstParagraph"/>
       </w:pPr>
       <w:r>
-        <w:t xml:space="preserve">The code is available on GitHub. Start with:</w:t>
+        <w:t>The code is available on GitHub. Start with:</w:t>
       </w:r>
     </w:p>
     <w:p>
@@ -1398,7 +1393,7 @@
         <w:rPr>
           <w:rStyle w:val="ImportTok"/>
         </w:rPr>
-        <w:t xml:space="preserve">from</w:t>
+        <w:t>from</w:t>
       </w:r>
       <w:r>
         <w:rPr>
@@ -1410,7 +1405,7 @@
         <w:rPr>
           <w:rStyle w:val="ImportTok"/>
         </w:rPr>
-        <w:t xml:space="preserve">import</w:t>
+        <w:t>import</w:t>
       </w:r>
       <w:r>
         <w:rPr>
@@ -1434,7 +1429,7 @@
         <w:rPr>
           <w:rStyle w:val="OperatorTok"/>
         </w:rPr>
-        <w:t xml:space="preserve">=</w:t>
+        <w:t>=</w:t>
       </w:r>
       <w:r>
         <w:rPr>
@@ -1446,19 +1441,19 @@
         <w:rPr>
           <w:rStyle w:val="OperatorTok"/>
         </w:rPr>
-        <w:t xml:space="preserve">=</w:t>
+        <w:t>=</w:t>
       </w:r>
       <w:r>
         <w:rPr>
           <w:rStyle w:val="StringTok"/>
         </w:rPr>
-        <w:t xml:space="preserve">"localhost:50060"</w:t>
+        <w:t>"localhost:50060"</w:t>
       </w:r>
       <w:r>
         <w:rPr>
           <w:rStyle w:val="NormalTok"/>
         </w:rPr>
-        <w:t xml:space="preserve">)</w:t>
+        <w:t>)</w:t>
       </w:r>
       <w:r>
         <w:br/>
@@ -1473,7 +1468,7 @@
         <w:rPr>
           <w:rStyle w:val="OperatorTok"/>
         </w:rPr>
-        <w:t xml:space="preserve">=</w:t>
+        <w:t>=</w:t>
       </w:r>
       <w:r>
         <w:rPr>
@@ -1491,7 +1486,7 @@
         <w:rPr>
           <w:rStyle w:val="ControlFlowTok"/>
         </w:rPr>
-        <w:t xml:space="preserve">if</w:t>
+        <w:t>if</w:t>
       </w:r>
       <w:r>
         <w:rPr>
@@ -1503,7 +1498,7 @@
         <w:rPr>
           <w:rStyle w:val="OperatorTok"/>
         </w:rPr>
-        <w:t xml:space="preserve">==</w:t>
+        <w:t>==</w:t>
       </w:r>
       <w:r>
         <w:rPr>
@@ -1523,8 +1518,8 @@
     </w:p>
     <w:p>
       <w:r>
-        <w:pict>
-          <v:rect style="width:0;height:1.5pt" o:hralign="center" o:hrstd="t" o:hr="t"/>
+        <w:pict w14:anchorId="4419C93F">
+          <v:rect id="_x0000_i1026" style="width:0;height:1.5pt" o:hralign="center" o:hrstd="t" o:hr="t"/>
         </w:pict>
       </w:r>
     </w:p>
@@ -1537,7 +1532,7 @@
           <w:i/>
           <w:iCs/>
         </w:rPr>
-        <w:t xml:space="preserve">This work represents a step toward AGI systems that are safe by design rather than safe by hope. We believe the path to beneficial AI requires this kind of principled, mathematically grounded approach to ethics—one that can be verified, audited, and improved through empirical feedback.</w:t>
+        <w:t>This work represents a step toward AGI systems that are safe by design rather than safe by hope. We believe the path to beneficial AI requires this kind of principled, mathematically grounded approach to ethics—one that can be verified, audited, and improved through empirical feedback.</w:t>
       </w:r>
     </w:p>
     <w:p>
@@ -1549,13 +1544,13 @@
           <w:i/>
           <w:iCs/>
         </w:rPr>
-        <w:t xml:space="preserve">Interested in AI safety research? Let’s connect.</w:t>
-      </w:r>
-    </w:p>
-    <w:p>
-      <w:r>
-        <w:pict>
-          <v:rect style="width:0;height:1.5pt" o:hralign="center" o:hrstd="t" o:hr="t"/>
+        <w:t>Interested in AI safety research? Let’s connect.</w:t>
+      </w:r>
+    </w:p>
+    <w:p>
+      <w:r>
+        <w:pict w14:anchorId="2C4A52E0">
+          <v:rect id="_x0000_i1027" style="width:0;height:1.5pt" o:hralign="center" o:hrstd="t" o:hr="t"/>
         </w:pict>
       </w:r>
     </w:p>
@@ -1568,19 +1563,10 @@
           <w:b/>
           <w:bCs/>
         </w:rPr>
-        <w:t xml:space="preserve">Andrew H. Bond, Senior Member IEEE</w:t>
-      </w:r>
-      <w:r>
-        <w:t xml:space="preserve"> </w:t>
-      </w:r>
-      <w:r>
-        <w:t xml:space="preserve">Department of Computer Engineering</w:t>
-      </w:r>
-      <w:r>
-        <w:t xml:space="preserve"> </w:t>
-      </w:r>
-      <w:r>
-        <w:t xml:space="preserve">San Jose State University</w:t>
+        <w:t>Andrew H. Bond, Senior Member IEEE</w:t>
+      </w:r>
+      <w:r>
+        <w:t xml:space="preserve"> Department of Computer Engineering San Jose State University</w:t>
       </w:r>
     </w:p>
     <w:p>
@@ -1588,24 +1574,25 @@
         <w:pStyle w:val="BodyText"/>
       </w:pPr>
       <w:r>
-        <w:t xml:space="preserve">#AISafety #AGI #EthicalAI #MachineLearning #Research #SJSU #Robotics #SafetyEngineering</w:t>
-      </w:r>
-    </w:p>
-    <w:p>
-      <w:r>
-        <w:pict>
-          <v:rect style="width:0;height:1.5pt" o:hralign="center" o:hrstd="t" o:hr="t"/>
+        <w:t>#AISafety #AGI #EthicalAI #MachineLearning #Research #SJSU #Robotics #SafetyEngineering</w:t>
+      </w:r>
+    </w:p>
+    <w:p>
+      <w:r>
+        <w:lastRenderedPageBreak/>
+        <w:pict w14:anchorId="3A5A1ED0">
+          <v:rect id="_x0000_i1028" style="width:0;height:1.5pt" o:hralign="center" o:hrstd="t" o:hr="t"/>
         </w:pict>
       </w:r>
     </w:p>
-    <w:bookmarkEnd w:id="22"/>
-    <w:bookmarkStart w:id="23" w:name="technical-details"/>
     <w:p>
       <w:pPr>
         <w:pStyle w:val="Heading2"/>
       </w:pPr>
-      <w:r>
-        <w:t xml:space="preserve">Technical Details</w:t>
+      <w:bookmarkStart w:id="15" w:name="technical-details"/>
+      <w:bookmarkEnd w:id="14"/>
+      <w:r>
+        <w:t>Technical Details</w:t>
       </w:r>
     </w:p>
     <w:p>
@@ -1617,10 +1604,10 @@
           <w:b/>
           <w:bCs/>
         </w:rPr>
-        <w:t xml:space="preserve">Repository</w:t>
-      </w:r>
-      <w:r>
-        <w:t xml:space="preserve">: github.com/ahb-sjsu/agi-hpc</w:t>
+        <w:t>Repository</w:t>
+      </w:r>
+      <w:r>
+        <w:t>: github.com/ahb-sjsu/agi-hpc</w:t>
       </w:r>
     </w:p>
     <w:p>
@@ -1632,94 +1619,46 @@
           <w:b/>
           <w:bCs/>
         </w:rPr>
-        <w:t xml:space="preserve">New Components</w:t>
-      </w:r>
-      <w:r>
-        <w:t xml:space="preserve">:</w:t>
-      </w:r>
-      <w:r>
-        <w:t xml:space="preserve"> </w:t>
-      </w:r>
-      <w:r>
-        <w:t xml:space="preserve">-</w:t>
-      </w:r>
-      <w:r>
-        <w:t xml:space="preserve"> </w:t>
+        <w:t>New Components</w:t>
+      </w:r>
+      <w:r>
+        <w:t xml:space="preserve">: - </w:t>
       </w:r>
       <w:r>
         <w:rPr>
           <w:rStyle w:val="VerbatimChar"/>
         </w:rPr>
-        <w:t xml:space="preserve">proto/erisml.proto</w:t>
-      </w:r>
-      <w:r>
-        <w:t xml:space="preserve"> </w:t>
-      </w:r>
-      <w:r>
-        <w:t xml:space="preserve">— 180 lines of protocol definitions</w:t>
-      </w:r>
-      <w:r>
-        <w:t xml:space="preserve"> </w:t>
-      </w:r>
-      <w:r>
-        <w:t xml:space="preserve">-</w:t>
-      </w:r>
-      <w:r>
-        <w:t xml:space="preserve"> </w:t>
+        <w:t>proto/erisml.proto</w:t>
+      </w:r>
+      <w:r>
+        <w:t xml:space="preserve"> — 180 lines of protocol definitions - </w:t>
       </w:r>
       <w:r>
         <w:rPr>
           <w:rStyle w:val="VerbatimChar"/>
         </w:rPr>
-        <w:t xml:space="preserve">proto/safety.proto</w:t>
-      </w:r>
-      <w:r>
-        <w:t xml:space="preserve"> </w:t>
-      </w:r>
-      <w:r>
-        <w:t xml:space="preserve">— 220 lines of protocol definitions</w:t>
-      </w:r>
-      <w:r>
-        <w:t xml:space="preserve"> </w:t>
-      </w:r>
-      <w:r>
-        <w:t xml:space="preserve">-</w:t>
-      </w:r>
-      <w:r>
-        <w:t xml:space="preserve"> </w:t>
+        <w:t>proto/safety.proto</w:t>
+      </w:r>
+      <w:r>
+        <w:t xml:space="preserve"> — 220 lines of protocol definitions - </w:t>
       </w:r>
       <w:r>
         <w:rPr>
           <w:rStyle w:val="VerbatimChar"/>
         </w:rPr>
-        <w:t xml:space="preserve">src/agi/safety/</w:t>
-      </w:r>
-      <w:r>
-        <w:t xml:space="preserve"> </w:t>
-      </w:r>
-      <w:r>
-        <w:t xml:space="preserve">— Reference implementation (~800 lines)</w:t>
-      </w:r>
-      <w:r>
-        <w:t xml:space="preserve"> </w:t>
-      </w:r>
-      <w:r>
-        <w:t xml:space="preserve">-</w:t>
-      </w:r>
-      <w:r>
-        <w:t xml:space="preserve"> </w:t>
+        <w:t>src/agi/safety/</w:t>
+      </w:r>
+      <w:r>
+        <w:t xml:space="preserve"> — Reference implementation (~800 lines) - </w:t>
       </w:r>
       <w:r>
         <w:rPr>
           <w:rStyle w:val="VerbatimChar"/>
         </w:rPr>
-        <w:t xml:space="preserve">docs/ERISML_API.md</w:t>
-      </w:r>
-      <w:r>
-        <w:t xml:space="preserve"> </w:t>
-      </w:r>
-      <w:r>
-        <w:t xml:space="preserve">— Full API documentation</w:t>
+        <w:t>docs/ERISML_API.md</w:t>
+      </w:r>
+      <w:r>
+        <w:t xml:space="preserve"> — Full API documentation</w:t>
       </w:r>
     </w:p>
     <w:p>
@@ -1731,10 +1670,10 @@
           <w:b/>
           <w:bCs/>
         </w:rPr>
-        <w:t xml:space="preserve">Test Coverage</w:t>
-      </w:r>
-      <w:r>
-        <w:t xml:space="preserve">: 285 tests passing</w:t>
+        <w:t>Test Coverage</w:t>
+      </w:r>
+      <w:r>
+        <w:t>: 285 tests passing</w:t>
       </w:r>
     </w:p>
     <w:p>
@@ -1746,51 +1685,32 @@
           <w:b/>
           <w:bCs/>
         </w:rPr>
-        <w:t xml:space="preserve">Key Dependencies</w:t>
-      </w:r>
-      <w:r>
-        <w:t xml:space="preserve">: gRPC, Protocol Buffers, Python 3.10+</w:t>
-      </w:r>
-    </w:p>
-    <w:bookmarkEnd w:id="23"/>
-    <w:bookmarkEnd w:id="24"/>
+        <w:t>Key Dependencies</w:t>
+      </w:r>
+      <w:r>
+        <w:t>: gRPC, Protocol Buffers, Python 3.10+</w:t>
+      </w:r>
+      <w:bookmarkEnd w:id="0"/>
+      <w:bookmarkEnd w:id="15"/>
+    </w:p>
     <w:sectPr>
       <w:footnotePr>
         <w:numRestart w:val="eachSect"/>
       </w:footnotePr>
+      <w:pgSz w:w="12240" w:h="15840"/>
+      <w:pgMar w:top="1440" w:right="1440" w:bottom="1440" w:left="1440" w:header="720" w:footer="720" w:gutter="0"/>
+      <w:cols w:space="720"/>
     </w:sectPr>
   </w:body>
 </w:document>
 </file>
 
-<file path=word/comments.xml><?xml version="1.0" encoding="utf-8"?>
-<w:comments xmlns:w="http://schemas.openxmlformats.org/wordprocessingml/2006/main" xmlns:m="http://schemas.openxmlformats.org/officeDocument/2006/math" xmlns:r="http://schemas.openxmlformats.org/officeDocument/2006/relationships" xmlns:o="urn:schemas-microsoft-com:office:office" xmlns:v="urn:schemas-microsoft-com:vml" xmlns:w10="urn:schemas-microsoft-com:office:word" xmlns:a="http://schemas.openxmlformats.org/drawingml/2006/main" xmlns:pic="http://schemas.openxmlformats.org/drawingml/2006/picture" xmlns:wp="http://schemas.openxmlformats.org/drawingml/2006/wordprocessingDrawing"/>
-</file>
-
-<file path=word/footnotes.xml><?xml version="1.0" encoding="utf-8"?>
-<w:footnotes xmlns:w="http://schemas.openxmlformats.org/wordprocessingml/2006/main" xmlns:m="http://schemas.openxmlformats.org/officeDocument/2006/math" xmlns:r="http://schemas.openxmlformats.org/officeDocument/2006/relationships" xmlns:o="urn:schemas-microsoft-com:office:office" xmlns:v="urn:schemas-microsoft-com:vml" xmlns:w10="urn:schemas-microsoft-com:office:word" xmlns:a="http://schemas.openxmlformats.org/drawingml/2006/main" xmlns:pic="http://schemas.openxmlformats.org/drawingml/2006/picture" xmlns:wp="http://schemas.openxmlformats.org/drawingml/2006/wordprocessingDrawing">
-  <w:footnote w:type="continuationSeparator" w:id="0">
-    <w:p>
-      <w:r>
-        <w:continuationSeparator/>
-      </w:r>
-    </w:p>
-  </w:footnote>
-  <w:footnote w:type="separator" w:id="-1">
-    <w:p>
-      <w:r>
-        <w:separator/>
-      </w:r>
-    </w:p>
-  </w:footnote>
-</w:footnotes>
-</file>
-
 <file path=word/numbering.xml><?xml version="1.0" encoding="utf-8"?>
-<w:numbering xmlns:w="http://schemas.openxmlformats.org/wordprocessingml/2006/main">
-  <w:abstractNum w:abstractNumId="990">
+<w:numbering xmlns:wpc="http://schemas.microsoft.com/office/word/2010/wordprocessingCanvas" xmlns:cx="http://schemas.microsoft.com/office/drawing/2014/chartex" xmlns:cx1="http://schemas.microsoft.com/office/drawing/2015/9/8/chartex" xmlns:cx2="http://schemas.microsoft.com/office/drawing/2015/10/21/chartex" xmlns:cx3="http://schemas.microsoft.com/office/drawing/2016/5/9/chartex" xmlns:cx4="http://schemas.microsoft.com/office/drawing/2016/5/10/chartex" xmlns:cx5="http://schemas.microsoft.com/office/drawing/2016/5/11/chartex" xmlns:cx6="http://schemas.microsoft.com/office/drawing/2016/5/12/chartex" xmlns:cx7="http://schemas.microsoft.com/office/drawing/2016/5/13/chartex" xmlns:cx8="http://schemas.microsoft.com/office/drawing/2016/5/14/chartex" xmlns:mc="http://schemas.openxmlformats.org/markup-compatibility/2006" xmlns:aink="http://schemas.microsoft.com/office/drawing/2016/ink" xmlns:am3d="http://schemas.microsoft.com/office/drawing/2017/model3d" xmlns:o="urn:schemas-microsoft-com:office:office" xmlns:oel="http://schemas.microsoft.com/office/2019/extlst" xmlns:r="http://schemas.openxmlformats.org/officeDocument/2006/relationships" xmlns:m="http://schemas.openxmlformats.org/officeDocument/2006/math" xmlns:v="urn:schemas-microsoft-com:vml" xmlns:wp14="http://schemas.microsoft.com/office/word/2010/wordprocessingDrawing" xmlns:wp="http://schemas.openxmlformats.org/drawingml/2006/wordprocessingDrawing" xmlns:w10="urn:schemas-microsoft-com:office:word" xmlns:w="http://schemas.openxmlformats.org/wordprocessingml/2006/main" xmlns:w14="http://schemas.microsoft.com/office/word/2010/wordml" xmlns:w15="http://schemas.microsoft.com/office/word/2012/wordml" xmlns:w16cex="http://schemas.microsoft.com/office/word/2018/wordml/cex" xmlns:w16cid="http://schemas.microsoft.com/office/word/2016/wordml/cid" xmlns:w16="http://schemas.microsoft.com/office/word/2018/wordml" xmlns:w16du="http://schemas.microsoft.com/office/word/2023/wordml/word16du" xmlns:w16sdtdh="http://schemas.microsoft.com/office/word/2020/wordml/sdtdatahash" xmlns:w16sdtfl="http://schemas.microsoft.com/office/word/2024/wordml/sdtformatlock" xmlns:w16se="http://schemas.microsoft.com/office/word/2015/wordml/symex" xmlns:wpg="http://schemas.microsoft.com/office/word/2010/wordprocessingGroup" xmlns:wpi="http://schemas.microsoft.com/office/word/2010/wordprocessingInk" xmlns:wne="http://schemas.microsoft.com/office/word/2006/wordml" xmlns:wps="http://schemas.microsoft.com/office/word/2010/wordprocessingShape" mc:Ignorable="w14 w15 w16se w16cid w16 w16cex w16sdtdh w16sdtfl w16du wp14">
+  <w:abstractNum w:abstractNumId="0" w15:restartNumberingAfterBreak="0">
     <w:nsid w:val="0000A990"/>
     <w:multiLevelType w:val="multilevel"/>
+    <w:tmpl w:val="502E81F6"/>
     <w:lvl w:ilvl="0">
       <w:numFmt w:val="bullet"/>
       <w:lvlText w:val=" "/>
@@ -1864,94 +1784,10 @@
       </w:pPr>
     </w:lvl>
   </w:abstractNum>
-  <w:abstractNum w:abstractNumId="99411">
-    <w:nsid w:val="00A99411"/>
-    <w:multiLevelType w:val="multilevel"/>
-    <w:lvl w:ilvl="0">
-      <w:start w:val="1"/>
-      <w:numFmt w:val="decimal"/>
-      <w:lvlText w:val="%1."/>
-      <w:lvlJc w:val="left"/>
-      <w:pPr>
-        <w:ind w:left="720" w:hanging="360"/>
-      </w:pPr>
-    </w:lvl>
-    <w:lvl w:ilvl="1">
-      <w:start w:val="1"/>
-      <w:numFmt w:val="decimal"/>
-      <w:lvlText w:val="%2."/>
-      <w:lvlJc w:val="left"/>
-      <w:pPr>
-        <w:ind w:left="1440" w:hanging="360"/>
-      </w:pPr>
-    </w:lvl>
-    <w:lvl w:ilvl="2">
-      <w:start w:val="1"/>
-      <w:numFmt w:val="decimal"/>
-      <w:lvlText w:val="%3."/>
-      <w:lvlJc w:val="left"/>
-      <w:pPr>
-        <w:ind w:left="2160" w:hanging="360"/>
-      </w:pPr>
-    </w:lvl>
-    <w:lvl w:ilvl="3">
-      <w:start w:val="1"/>
-      <w:numFmt w:val="decimal"/>
-      <w:lvlText w:val="%4."/>
-      <w:lvlJc w:val="left"/>
-      <w:pPr>
-        <w:ind w:left="2880" w:hanging="360"/>
-      </w:pPr>
-    </w:lvl>
-    <w:lvl w:ilvl="4">
-      <w:start w:val="1"/>
-      <w:numFmt w:val="decimal"/>
-      <w:lvlText w:val="%5."/>
-      <w:lvlJc w:val="left"/>
-      <w:pPr>
-        <w:ind w:left="3600" w:hanging="360"/>
-      </w:pPr>
-    </w:lvl>
-    <w:lvl w:ilvl="5">
-      <w:start w:val="1"/>
-      <w:numFmt w:val="decimal"/>
-      <w:lvlText w:val="%6."/>
-      <w:lvlJc w:val="left"/>
-      <w:pPr>
-        <w:ind w:left="4320" w:hanging="360"/>
-      </w:pPr>
-    </w:lvl>
-    <w:lvl w:ilvl="6">
-      <w:start w:val="1"/>
-      <w:numFmt w:val="decimal"/>
-      <w:lvlText w:val="%7."/>
-      <w:lvlJc w:val="left"/>
-      <w:pPr>
-        <w:ind w:left="5040" w:hanging="360"/>
-      </w:pPr>
-    </w:lvl>
-    <w:lvl w:ilvl="7">
-      <w:start w:val="1"/>
-      <w:numFmt w:val="decimal"/>
-      <w:lvlText w:val="%8."/>
-      <w:lvlJc w:val="left"/>
-      <w:pPr>
-        <w:ind w:left="5760" w:hanging="360"/>
-      </w:pPr>
-    </w:lvl>
-    <w:lvl w:ilvl="8">
-      <w:start w:val="1"/>
-      <w:numFmt w:val="decimal"/>
-      <w:lvlText w:val="%9."/>
-      <w:lvlJc w:val="left"/>
-      <w:pPr>
-        <w:ind w:left="6480" w:hanging="360"/>
-      </w:pPr>
-    </w:lvl>
-  </w:abstractNum>
-  <w:abstractNum w:abstractNumId="991">
+  <w:abstractNum w:abstractNumId="1" w15:restartNumberingAfterBreak="0">
     <w:nsid w:val="0000A991"/>
     <w:multiLevelType w:val="multilevel"/>
+    <w:tmpl w:val="6114B086"/>
     <w:lvl w:ilvl="0">
       <w:numFmt w:val="bullet"/>
       <w:lvlText w:val=""/>
@@ -2052,11 +1888,97 @@
       </w:rPr>
     </w:lvl>
   </w:abstractNum>
-  <w:num w:numId="1000">
-    <w:abstractNumId w:val="990"/>
+  <w:abstractNum w:abstractNumId="2" w15:restartNumberingAfterBreak="0">
+    <w:nsid w:val="00A99411"/>
+    <w:multiLevelType w:val="multilevel"/>
+    <w:tmpl w:val="273A2800"/>
+    <w:lvl w:ilvl="0">
+      <w:start w:val="1"/>
+      <w:numFmt w:val="decimal"/>
+      <w:lvlText w:val="%1."/>
+      <w:lvlJc w:val="left"/>
+      <w:pPr>
+        <w:ind w:left="720" w:hanging="360"/>
+      </w:pPr>
+    </w:lvl>
+    <w:lvl w:ilvl="1">
+      <w:start w:val="1"/>
+      <w:numFmt w:val="decimal"/>
+      <w:lvlText w:val="%2."/>
+      <w:lvlJc w:val="left"/>
+      <w:pPr>
+        <w:ind w:left="1440" w:hanging="360"/>
+      </w:pPr>
+    </w:lvl>
+    <w:lvl w:ilvl="2">
+      <w:start w:val="1"/>
+      <w:numFmt w:val="decimal"/>
+      <w:lvlText w:val="%3."/>
+      <w:lvlJc w:val="left"/>
+      <w:pPr>
+        <w:ind w:left="2160" w:hanging="360"/>
+      </w:pPr>
+    </w:lvl>
+    <w:lvl w:ilvl="3">
+      <w:start w:val="1"/>
+      <w:numFmt w:val="decimal"/>
+      <w:lvlText w:val="%4."/>
+      <w:lvlJc w:val="left"/>
+      <w:pPr>
+        <w:ind w:left="2880" w:hanging="360"/>
+      </w:pPr>
+    </w:lvl>
+    <w:lvl w:ilvl="4">
+      <w:start w:val="1"/>
+      <w:numFmt w:val="decimal"/>
+      <w:lvlText w:val="%5."/>
+      <w:lvlJc w:val="left"/>
+      <w:pPr>
+        <w:ind w:left="3600" w:hanging="360"/>
+      </w:pPr>
+    </w:lvl>
+    <w:lvl w:ilvl="5">
+      <w:start w:val="1"/>
+      <w:numFmt w:val="decimal"/>
+      <w:lvlText w:val="%6."/>
+      <w:lvlJc w:val="left"/>
+      <w:pPr>
+        <w:ind w:left="4320" w:hanging="360"/>
+      </w:pPr>
+    </w:lvl>
+    <w:lvl w:ilvl="6">
+      <w:start w:val="1"/>
+      <w:numFmt w:val="decimal"/>
+      <w:lvlText w:val="%7."/>
+      <w:lvlJc w:val="left"/>
+      <w:pPr>
+        <w:ind w:left="5040" w:hanging="360"/>
+      </w:pPr>
+    </w:lvl>
+    <w:lvl w:ilvl="7">
+      <w:start w:val="1"/>
+      <w:numFmt w:val="decimal"/>
+      <w:lvlText w:val="%8."/>
+      <w:lvlJc w:val="left"/>
+      <w:pPr>
+        <w:ind w:left="5760" w:hanging="360"/>
+      </w:pPr>
+    </w:lvl>
+    <w:lvl w:ilvl="8">
+      <w:start w:val="1"/>
+      <w:numFmt w:val="decimal"/>
+      <w:lvlText w:val="%9."/>
+      <w:lvlJc w:val="left"/>
+      <w:pPr>
+        <w:ind w:left="6480" w:hanging="360"/>
+      </w:pPr>
+    </w:lvl>
+  </w:abstractNum>
+  <w:num w:numId="1" w16cid:durableId="922101718">
+    <w:abstractNumId w:val="0"/>
   </w:num>
-  <w:num w:numId="1001">
-    <w:abstractNumId w:val="99411"/>
+  <w:num w:numId="2" w16cid:durableId="1923906241">
+    <w:abstractNumId w:val="2"/>
     <w:lvlOverride w:ilvl="0">
       <w:startOverride w:val="1"/>
     </w:lvlOverride>
@@ -2085,14 +2007,14 @@
       <w:startOverride w:val="1"/>
     </w:lvlOverride>
   </w:num>
-  <w:num w:numId="1002">
-    <w:abstractNumId w:val="991"/>
+  <w:num w:numId="3" w16cid:durableId="115293901">
+    <w:abstractNumId w:val="1"/>
   </w:num>
-  <w:num w:numId="1003">
-    <w:abstractNumId w:val="991"/>
+  <w:num w:numId="4" w16cid:durableId="1148127266">
+    <w:abstractNumId w:val="1"/>
   </w:num>
-  <w:num w:numId="1004">
-    <w:abstractNumId w:val="99411"/>
+  <w:num w:numId="5" w16cid:durableId="1686663578">
+    <w:abstractNumId w:val="2"/>
     <w:lvlOverride w:ilvl="0">
       <w:startOverride w:val="1"/>
     </w:lvlOverride>
@@ -2121,27 +2043,27 @@
       <w:startOverride w:val="1"/>
     </w:lvlOverride>
   </w:num>
-  <w:num w:numId="1005">
-    <w:abstractNumId w:val="991"/>
+  <w:num w:numId="6" w16cid:durableId="1109350500">
+    <w:abstractNumId w:val="1"/>
   </w:num>
-  <w:num w:numId="1006">
-    <w:abstractNumId w:val="991"/>
+  <w:num w:numId="7" w16cid:durableId="1139617712">
+    <w:abstractNumId w:val="1"/>
   </w:num>
-  <w:num w:numId="1007">
-    <w:abstractNumId w:val="991"/>
+  <w:num w:numId="8" w16cid:durableId="939290184">
+    <w:abstractNumId w:val="1"/>
   </w:num>
 </w:numbering>
 </file>
 
 <file path=word/styles.xml><?xml version="1.0" encoding="utf-8"?>
-<w:styles xmlns:r="http://schemas.openxmlformats.org/officeDocument/2006/relationships" xmlns:w="http://schemas.openxmlformats.org/wordprocessingml/2006/main">
+<w:styles xmlns:mc="http://schemas.openxmlformats.org/markup-compatibility/2006" xmlns:r="http://schemas.openxmlformats.org/officeDocument/2006/relationships" xmlns:w="http://schemas.openxmlformats.org/wordprocessingml/2006/main" xmlns:w14="http://schemas.microsoft.com/office/word/2010/wordml" xmlns:w15="http://schemas.microsoft.com/office/word/2012/wordml" xmlns:w16cex="http://schemas.microsoft.com/office/word/2018/wordml/cex" xmlns:w16cid="http://schemas.microsoft.com/office/word/2016/wordml/cid" xmlns:w16="http://schemas.microsoft.com/office/word/2018/wordml" xmlns:w16du="http://schemas.microsoft.com/office/word/2023/wordml/word16du" xmlns:w16sdtdh="http://schemas.microsoft.com/office/word/2020/wordml/sdtdatahash" xmlns:w16sdtfl="http://schemas.microsoft.com/office/word/2024/wordml/sdtformatlock" xmlns:w16se="http://schemas.microsoft.com/office/word/2015/wordml/symex" mc:Ignorable="w14 w15 w16se w16cid w16 w16cex w16sdtdh w16sdtfl w16du">
   <w:docDefaults>
     <w:rPrDefault>
       <w:rPr>
-        <w:rFonts w:asciiTheme="minorHAnsi" w:cstheme="minorBidi" w:eastAsiaTheme="minorEastAsia" w:hAnsiTheme="minorHAnsi"/>
+        <w:rFonts w:asciiTheme="minorHAnsi" w:eastAsiaTheme="minorEastAsia" w:hAnsiTheme="minorHAnsi" w:cstheme="minorBidi"/>
         <w:sz w:val="24"/>
         <w:szCs w:val="24"/>
-        <w:lang w:bidi="ar-SA" w:eastAsia="zh-CN" w:val="en-US"/>
+        <w:lang w:val="en-US" w:eastAsia="zh-CN" w:bidi="ar-SA"/>
       </w:rPr>
     </w:rPrDefault>
     <w:pPrDefault>
@@ -2150,168 +2072,255 @@
       </w:pPr>
     </w:pPrDefault>
   </w:docDefaults>
-  <w:latentStyles w:count="276" w:defLockedState="0" w:defQFormat="0" w:defSemiHidden="0" w:defUIPriority="0" w:defUnhideWhenUsed="0"/>
-  <w:style w:default="1" w:styleId="Normal" w:type="paragraph">
+  <w:latentStyles w:defLockedState="0" w:defUIPriority="0" w:defSemiHidden="0" w:defUnhideWhenUsed="0" w:defQFormat="0" w:count="376">
+    <w:lsdException w:name="Normal Table" w:semiHidden="1" w:unhideWhenUsed="1"/>
+    <w:lsdException w:name="Table Simple 1" w:semiHidden="1" w:unhideWhenUsed="1"/>
+    <w:lsdException w:name="Table Simple 2" w:semiHidden="1" w:unhideWhenUsed="1"/>
+    <w:lsdException w:name="Table Simple 3" w:semiHidden="1" w:unhideWhenUsed="1"/>
+    <w:lsdException w:name="Table Classic 1" w:semiHidden="1" w:unhideWhenUsed="1"/>
+    <w:lsdException w:name="Table Classic 2" w:semiHidden="1" w:unhideWhenUsed="1"/>
+    <w:lsdException w:name="Table Classic 3" w:semiHidden="1" w:unhideWhenUsed="1"/>
+    <w:lsdException w:name="Table Classic 4" w:semiHidden="1" w:unhideWhenUsed="1"/>
+    <w:lsdException w:name="Table Colorful 1" w:semiHidden="1" w:unhideWhenUsed="1"/>
+    <w:lsdException w:name="Table Colorful 2" w:semiHidden="1" w:unhideWhenUsed="1"/>
+    <w:lsdException w:name="Table Colorful 3" w:semiHidden="1" w:unhideWhenUsed="1"/>
+    <w:lsdException w:name="Table Columns 1" w:semiHidden="1" w:unhideWhenUsed="1"/>
+    <w:lsdException w:name="Table Columns 2" w:semiHidden="1" w:unhideWhenUsed="1"/>
+    <w:lsdException w:name="Table Columns 3" w:semiHidden="1" w:unhideWhenUsed="1"/>
+    <w:lsdException w:name="Table Columns 4" w:semiHidden="1" w:unhideWhenUsed="1"/>
+    <w:lsdException w:name="Table Columns 5" w:semiHidden="1" w:unhideWhenUsed="1"/>
+    <w:lsdException w:name="Table Grid 1" w:semiHidden="1" w:unhideWhenUsed="1"/>
+    <w:lsdException w:name="Table Grid 2" w:semiHidden="1" w:unhideWhenUsed="1"/>
+    <w:lsdException w:name="Table Grid 3" w:semiHidden="1" w:unhideWhenUsed="1"/>
+    <w:lsdException w:name="Table Grid 4" w:semiHidden="1" w:unhideWhenUsed="1"/>
+    <w:lsdException w:name="Table Grid 5" w:semiHidden="1" w:unhideWhenUsed="1"/>
+    <w:lsdException w:name="Table Grid 6" w:semiHidden="1" w:unhideWhenUsed="1"/>
+    <w:lsdException w:name="Table Grid 7" w:semiHidden="1" w:unhideWhenUsed="1"/>
+    <w:lsdException w:name="Table Grid 8" w:semiHidden="1" w:unhideWhenUsed="1"/>
+    <w:lsdException w:name="Table List 1" w:semiHidden="1" w:unhideWhenUsed="1"/>
+    <w:lsdException w:name="Table List 2" w:semiHidden="1" w:unhideWhenUsed="1"/>
+    <w:lsdException w:name="Table List 3" w:semiHidden="1" w:unhideWhenUsed="1"/>
+    <w:lsdException w:name="Table List 4" w:semiHidden="1" w:unhideWhenUsed="1"/>
+    <w:lsdException w:name="Table List 5" w:semiHidden="1" w:unhideWhenUsed="1"/>
+    <w:lsdException w:name="Table List 6" w:semiHidden="1" w:unhideWhenUsed="1"/>
+    <w:lsdException w:name="Table List 7" w:semiHidden="1" w:unhideWhenUsed="1"/>
+    <w:lsdException w:name="Table List 8" w:semiHidden="1" w:unhideWhenUsed="1"/>
+    <w:lsdException w:name="Table 3D effects 1" w:semiHidden="1" w:unhideWhenUsed="1"/>
+    <w:lsdException w:name="Table 3D effects 2" w:semiHidden="1" w:unhideWhenUsed="1"/>
+    <w:lsdException w:name="Table 3D effects 3" w:semiHidden="1" w:unhideWhenUsed="1"/>
+    <w:lsdException w:name="Table Contemporary" w:semiHidden="1" w:unhideWhenUsed="1"/>
+    <w:lsdException w:name="Table Elegant" w:semiHidden="1" w:unhideWhenUsed="1"/>
+    <w:lsdException w:name="Table Professional" w:semiHidden="1" w:unhideWhenUsed="1"/>
+    <w:lsdException w:name="Table Subtle 1" w:semiHidden="1" w:unhideWhenUsed="1"/>
+    <w:lsdException w:name="Table Subtle 2" w:semiHidden="1" w:unhideWhenUsed="1"/>
+    <w:lsdException w:name="Table Web 1" w:semiHidden="1" w:unhideWhenUsed="1"/>
+    <w:lsdException w:name="Table Web 2" w:semiHidden="1" w:unhideWhenUsed="1"/>
+    <w:lsdException w:name="Table Web 3" w:semiHidden="1" w:unhideWhenUsed="1"/>
+    <w:lsdException w:name="Table Theme" w:semiHidden="1" w:unhideWhenUsed="1"/>
+    <w:lsdException w:name="Light Shading"/>
+    <w:lsdException w:name="Light List"/>
+    <w:lsdException w:name="Light Grid"/>
+    <w:lsdException w:name="Medium Shading 1"/>
+    <w:lsdException w:name="Medium Shading 2"/>
+    <w:lsdException w:name="Medium List 1"/>
+    <w:lsdException w:name="Medium List 2"/>
+    <w:lsdException w:name="Medium Grid 1"/>
+    <w:lsdException w:name="Medium Grid 2"/>
+    <w:lsdException w:name="Medium Grid 3"/>
+    <w:lsdException w:name="Dark List"/>
+    <w:lsdException w:name="Colorful Shading"/>
+    <w:lsdException w:name="Colorful List"/>
+    <w:lsdException w:name="Colorful Grid"/>
+    <w:lsdException w:name="Light Shading Accent 1"/>
+    <w:lsdException w:name="Light List Accent 1"/>
+    <w:lsdException w:name="Light Grid Accent 1"/>
+    <w:lsdException w:name="Medium Shading 1 Accent 1"/>
+    <w:lsdException w:name="Medium Shading 2 Accent 1"/>
+    <w:lsdException w:name="Medium List 1 Accent 1"/>
+    <w:lsdException w:name="Medium List 2 Accent 1"/>
+    <w:lsdException w:name="Medium Grid 1 Accent 1"/>
+    <w:lsdException w:name="Medium Grid 2 Accent 1"/>
+    <w:lsdException w:name="Medium Grid 3 Accent 1"/>
+    <w:lsdException w:name="Dark List Accent 1"/>
+    <w:lsdException w:name="Colorful Shading Accent 1"/>
+    <w:lsdException w:name="Colorful List Accent 1"/>
+    <w:lsdException w:name="Colorful Grid Accent 1"/>
+    <w:lsdException w:name="Light Shading Accent 2"/>
+    <w:lsdException w:name="Light List Accent 2"/>
+    <w:lsdException w:name="Light Grid Accent 2"/>
+    <w:lsdException w:name="Medium Shading 1 Accent 2"/>
+    <w:lsdException w:name="Medium Shading 2 Accent 2"/>
+    <w:lsdException w:name="Medium List 1 Accent 2"/>
+    <w:lsdException w:name="Medium List 2 Accent 2"/>
+    <w:lsdException w:name="Medium Grid 1 Accent 2"/>
+    <w:lsdException w:name="Medium Grid 2 Accent 2"/>
+    <w:lsdException w:name="Medium Grid 3 Accent 2"/>
+    <w:lsdException w:name="Dark List Accent 2"/>
+    <w:lsdException w:name="Colorful Shading Accent 2"/>
+    <w:lsdException w:name="Colorful List Accent 2"/>
+    <w:lsdException w:name="Colorful Grid Accent 2"/>
+    <w:lsdException w:name="Light Shading Accent 3"/>
+    <w:lsdException w:name="Light List Accent 3"/>
+    <w:lsdException w:name="Light Grid Accent 3"/>
+    <w:lsdException w:name="Medium Shading 1 Accent 3"/>
+    <w:lsdException w:name="Medium Shading 2 Accent 3"/>
+    <w:lsdException w:name="Medium List 1 Accent 3"/>
+    <w:lsdException w:name="Medium List 2 Accent 3"/>
+    <w:lsdException w:name="Medium Grid 1 Accent 3"/>
+    <w:lsdException w:name="Medium Grid 2 Accent 3"/>
+    <w:lsdException w:name="Medium Grid 3 Accent 3"/>
+    <w:lsdException w:name="Dark List Accent 3"/>
+    <w:lsdException w:name="Colorful Shading Accent 3"/>
+    <w:lsdException w:name="Colorful List Accent 3"/>
+    <w:lsdException w:name="Colorful Grid Accent 3"/>
+    <w:lsdException w:name="Light Shading Accent 4"/>
+    <w:lsdException w:name="Light List Accent 4"/>
+    <w:lsdException w:name="Light Grid Accent 4"/>
+    <w:lsdException w:name="Medium Shading 1 Accent 4"/>
+    <w:lsdException w:name="Medium Shading 2 Accent 4"/>
+    <w:lsdException w:name="Medium List 1 Accent 4"/>
+    <w:lsdException w:name="Medium List 2 Accent 4"/>
+    <w:lsdException w:name="Medium Grid 1 Accent 4"/>
+    <w:lsdException w:name="Medium Grid 2 Accent 4"/>
+    <w:lsdException w:name="Medium Grid 3 Accent 4"/>
+    <w:lsdException w:name="Dark List Accent 4"/>
+    <w:lsdException w:name="Colorful Shading Accent 4"/>
+    <w:lsdException w:name="Colorful List Accent 4"/>
+    <w:lsdException w:name="Colorful Grid Accent 4"/>
+    <w:lsdException w:name="Light Shading Accent 5"/>
+    <w:lsdException w:name="Light List Accent 5"/>
+    <w:lsdException w:name="Light Grid Accent 5"/>
+    <w:lsdException w:name="Medium Shading 1 Accent 5"/>
+    <w:lsdException w:name="Medium Shading 2 Accent 5"/>
+    <w:lsdException w:name="Medium List 1 Accent 5"/>
+    <w:lsdException w:name="Medium List 2 Accent 5"/>
+    <w:lsdException w:name="Medium Grid 1 Accent 5"/>
+    <w:lsdException w:name="Medium Grid 2 Accent 5"/>
+    <w:lsdException w:name="Medium Grid 3 Accent 5"/>
+    <w:lsdException w:name="Dark List Accent 5"/>
+    <w:lsdException w:name="Colorful Shading Accent 5"/>
+    <w:lsdException w:name="Colorful List Accent 5"/>
+    <w:lsdException w:name="Colorful Grid Accent 5"/>
+    <w:lsdException w:name="Light Shading Accent 6"/>
+    <w:lsdException w:name="Light List Accent 6"/>
+    <w:lsdException w:name="Light Grid Accent 6"/>
+    <w:lsdException w:name="Medium Shading 1 Accent 6"/>
+    <w:lsdException w:name="Medium Shading 2 Accent 6"/>
+    <w:lsdException w:name="Medium List 1 Accent 6"/>
+    <w:lsdException w:name="Medium List 2 Accent 6"/>
+    <w:lsdException w:name="Medium Grid 1 Accent 6"/>
+    <w:lsdException w:name="Medium Grid 2 Accent 6"/>
+    <w:lsdException w:name="Medium Grid 3 Accent 6"/>
+    <w:lsdException w:name="Dark List Accent 6"/>
+    <w:lsdException w:name="Colorful Shading Accent 6"/>
+    <w:lsdException w:name="Colorful List Accent 6"/>
+    <w:lsdException w:name="Colorful Grid Accent 6"/>
+    <w:lsdException w:name="Grid Table 4" w:uiPriority="49"/>
+    <w:lsdException w:name="Grid Table 5 Dark" w:uiPriority="50"/>
+    <w:lsdException w:name="Grid Table 6 Colorful" w:uiPriority="51"/>
+    <w:lsdException w:name="Grid Table 7 Colorful" w:uiPriority="52"/>
+    <w:lsdException w:name="Grid Table 1 Light Accent 1" w:uiPriority="46"/>
+    <w:lsdException w:name="Grid Table 2 Accent 1" w:uiPriority="47"/>
+    <w:lsdException w:name="Grid Table 3 Accent 1" w:uiPriority="48"/>
+    <w:lsdException w:name="Grid Table 4 Accent 1" w:uiPriority="49"/>
+    <w:lsdException w:name="Grid Table 5 Dark Accent 1" w:uiPriority="50"/>
+    <w:lsdException w:name="Grid Table 6 Colorful Accent 1" w:uiPriority="51"/>
+    <w:lsdException w:name="Grid Table 7 Colorful Accent 1" w:uiPriority="52"/>
+    <w:lsdException w:name="Grid Table 1 Light Accent 2" w:uiPriority="46"/>
+    <w:lsdException w:name="Grid Table 2 Accent 2" w:uiPriority="47"/>
+    <w:lsdException w:name="Grid Table 3 Accent 2" w:uiPriority="48"/>
+    <w:lsdException w:name="Grid Table 4 Accent 2" w:uiPriority="49"/>
+    <w:lsdException w:name="Grid Table 5 Dark Accent 2" w:uiPriority="50"/>
+    <w:lsdException w:name="Grid Table 6 Colorful Accent 2" w:uiPriority="51"/>
+    <w:lsdException w:name="Grid Table 7 Colorful Accent 2" w:uiPriority="52"/>
+    <w:lsdException w:name="Grid Table 1 Light Accent 3" w:uiPriority="46"/>
+    <w:lsdException w:name="Grid Table 2 Accent 3" w:uiPriority="47"/>
+    <w:lsdException w:name="Grid Table 3 Accent 3" w:uiPriority="48"/>
+    <w:lsdException w:name="Grid Table 4 Accent 3" w:uiPriority="49"/>
+    <w:lsdException w:name="Grid Table 5 Dark Accent 3" w:uiPriority="50"/>
+    <w:lsdException w:name="Grid Table 6 Colorful Accent 3" w:uiPriority="51"/>
+    <w:lsdException w:name="Grid Table 7 Colorful Accent 3" w:uiPriority="52"/>
+    <w:lsdException w:name="Grid Table 1 Light Accent 4" w:uiPriority="46"/>
+    <w:lsdException w:name="Grid Table 2 Accent 4" w:uiPriority="47"/>
+    <w:lsdException w:name="Grid Table 3 Accent 4" w:uiPriority="48"/>
+    <w:lsdException w:name="Grid Table 4 Accent 4" w:uiPriority="49"/>
+    <w:lsdException w:name="Grid Table 5 Dark Accent 4" w:uiPriority="50"/>
+    <w:lsdException w:name="Grid Table 6 Colorful Accent 4" w:uiPriority="51"/>
+    <w:lsdException w:name="Grid Table 7 Colorful Accent 4" w:uiPriority="52"/>
+    <w:lsdException w:name="Grid Table 1 Light Accent 5" w:uiPriority="46"/>
+    <w:lsdException w:name="Grid Table 2 Accent 5" w:uiPriority="47"/>
+    <w:lsdException w:name="Grid Table 3 Accent 5" w:uiPriority="48"/>
+    <w:lsdException w:name="Grid Table 4 Accent 5" w:uiPriority="49"/>
+    <w:lsdException w:name="Grid Table 5 Dark Accent 5" w:uiPriority="50"/>
+    <w:lsdException w:name="Grid Table 6 Colorful Accent 5" w:uiPriority="51"/>
+    <w:lsdException w:name="Grid Table 7 Colorful Accent 5" w:uiPriority="52"/>
+    <w:lsdException w:name="Grid Table 1 Light Accent 6" w:uiPriority="46"/>
+    <w:lsdException w:name="Grid Table 2 Accent 6" w:uiPriority="47"/>
+    <w:lsdException w:name="Grid Table 3 Accent 6" w:uiPriority="48"/>
+    <w:lsdException w:name="Grid Table 4 Accent 6" w:uiPriority="49"/>
+    <w:lsdException w:name="Grid Table 5 Dark Accent 6" w:uiPriority="50"/>
+    <w:lsdException w:name="Grid Table 6 Colorful Accent 6" w:uiPriority="51"/>
+    <w:lsdException w:name="Grid Table 7 Colorful Accent 6" w:uiPriority="52"/>
+    <w:lsdException w:name="List Table 1 Light" w:uiPriority="46"/>
+    <w:lsdException w:name="List Table 2" w:uiPriority="47"/>
+    <w:lsdException w:name="List Table 3" w:uiPriority="48"/>
+    <w:lsdException w:name="List Table 4" w:uiPriority="49"/>
+    <w:lsdException w:name="List Table 5 Dark" w:uiPriority="50"/>
+    <w:lsdException w:name="List Table 6 Colorful" w:uiPriority="51"/>
+    <w:lsdException w:name="List Table 7 Colorful" w:uiPriority="52"/>
+    <w:lsdException w:name="List Table 1 Light Accent 1" w:uiPriority="46"/>
+    <w:lsdException w:name="List Table 2 Accent 1" w:uiPriority="47"/>
+    <w:lsdException w:name="List Table 3 Accent 1" w:uiPriority="48"/>
+    <w:lsdException w:name="List Table 4 Accent 1" w:uiPriority="49"/>
+    <w:lsdException w:name="List Table 5 Dark Accent 1" w:uiPriority="50"/>
+    <w:lsdException w:name="List Table 6 Colorful Accent 1" w:uiPriority="51"/>
+    <w:lsdException w:name="List Table 7 Colorful Accent 1" w:uiPriority="52"/>
+    <w:lsdException w:name="List Table 1 Light Accent 2" w:uiPriority="46"/>
+    <w:lsdException w:name="List Table 2 Accent 2" w:uiPriority="47"/>
+    <w:lsdException w:name="List Table 3 Accent 2" w:uiPriority="48"/>
+    <w:lsdException w:name="List Table 4 Accent 2" w:uiPriority="49"/>
+    <w:lsdException w:name="List Table 5 Dark Accent 2" w:uiPriority="50"/>
+    <w:lsdException w:name="List Table 6 Colorful Accent 2" w:uiPriority="51"/>
+    <w:lsdException w:name="List Table 7 Colorful Accent 2" w:uiPriority="52"/>
+    <w:lsdException w:name="List Table 1 Light Accent 3" w:uiPriority="46"/>
+    <w:lsdException w:name="List Table 2 Accent 3" w:uiPriority="47"/>
+    <w:lsdException w:name="List Table 3 Accent 3" w:uiPriority="48"/>
+    <w:lsdException w:name="List Table 4 Accent 3" w:uiPriority="49"/>
+    <w:lsdException w:name="List Table 5 Dark Accent 3" w:uiPriority="50"/>
+    <w:lsdException w:name="List Table 6 Colorful Accent 3" w:uiPriority="51"/>
+    <w:lsdException w:name="List Table 7 Colorful Accent 3" w:uiPriority="52"/>
+    <w:lsdException w:name="List Table 1 Light Accent 4" w:uiPriority="46"/>
+    <w:lsdException w:name="List Table 2 Accent 4" w:uiPriority="47"/>
+    <w:lsdException w:name="List Table 3 Accent 4" w:uiPriority="48"/>
+    <w:lsdException w:name="List Table 4 Accent 4" w:uiPriority="49"/>
+    <w:lsdException w:name="List Table 5 Dark Accent 4" w:uiPriority="50"/>
+    <w:lsdException w:name="List Table 6 Colorful Accent 4" w:uiPriority="51"/>
+    <w:lsdException w:name="List Table 7 Colorful Accent 4" w:uiPriority="52"/>
+    <w:lsdException w:name="List Table 1 Light Accent 5" w:uiPriority="46"/>
+    <w:lsdException w:name="List Table 2 Accent 5" w:uiPriority="47"/>
+    <w:lsdException w:name="List Table 3 Accent 5" w:uiPriority="48"/>
+    <w:lsdException w:name="List Table 4 Accent 5" w:uiPriority="49"/>
+    <w:lsdException w:name="List Table 5 Dark Accent 5" w:uiPriority="50"/>
+    <w:lsdException w:name="List Table 6 Colorful Accent 5" w:uiPriority="51"/>
+    <w:lsdException w:name="List Table 7 Colorful Accent 5" w:uiPriority="52"/>
+    <w:lsdException w:name="List Table 1 Light Accent 6" w:uiPriority="46"/>
+    <w:lsdException w:name="List Table 2 Accent 6" w:uiPriority="47"/>
+    <w:lsdException w:name="List Table 3 Accent 6" w:uiPriority="48"/>
+    <w:lsdException w:name="List Table 4 Accent 6" w:uiPriority="49"/>
+    <w:lsdException w:name="List Table 5 Dark Accent 6" w:uiPriority="50"/>
+    <w:lsdException w:name="List Table 6 Colorful Accent 6" w:uiPriority="51"/>
+    <w:lsdException w:name="List Table 7 Colorful Accent 6" w:uiPriority="52"/>
+    <w:lsdException w:name="Mention" w:semiHidden="1" w:uiPriority="99" w:unhideWhenUsed="1"/>
+    <w:lsdException w:name="Smart Hyperlink" w:semiHidden="1" w:uiPriority="99" w:unhideWhenUsed="1"/>
+    <w:lsdException w:name="Hashtag" w:semiHidden="1" w:uiPriority="99" w:unhideWhenUsed="1"/>
+    <w:lsdException w:name="Unresolved Mention" w:semiHidden="1" w:uiPriority="99" w:unhideWhenUsed="1"/>
+    <w:lsdException w:name="Smart Link" w:semiHidden="1" w:uiPriority="99" w:unhideWhenUsed="1"/>
+  </w:latentStyles>
+  <w:style w:type="paragraph" w:default="1" w:styleId="Normal">
     <w:name w:val="Normal"/>
     <w:qFormat/>
   </w:style>
-  <w:style w:styleId="BodyText" w:type="paragraph">
-    <w:name w:val="Body Text"/>
-    <w:basedOn w:val="Normal"/>
-    <w:link w:val="BodyTextChar"/>
-    <w:qFormat/>
-    <w:pPr>
-      <w:spacing w:after="180" w:before="180"/>
-    </w:pPr>
-  </w:style>
-  <w:style w:customStyle="1" w:styleId="FirstParagraph" w:type="paragraph">
-    <w:name w:val="First Paragraph"/>
-    <w:basedOn w:val="BodyText"/>
-    <w:next w:val="BodyText"/>
-    <w:qFormat/>
-  </w:style>
-  <w:style w:customStyle="1" w:styleId="Compact" w:type="paragraph">
-    <w:name w:val="Compact"/>
-    <w:basedOn w:val="BodyText"/>
-    <w:qFormat/>
-    <w:pPr>
-      <w:spacing w:after="36" w:before="36"/>
-    </w:pPr>
-  </w:style>
-  <w:style w:styleId="Title" w:type="paragraph">
-    <w:name w:val="Title"/>
-    <w:basedOn w:val="Normal"/>
-    <w:next w:val="BodyText"/>
-    <w:link w:val="TitleChar"/>
-    <w:uiPriority w:val="10"/>
-    <w:qFormat/>
-    <w:rsid w:val="00A10FD9"/>
-    <w:pPr>
-      <w:spacing w:after="80" w:line="240" w:lineRule="auto"/>
-      <w:contextualSpacing/>
-      <w:jc w:val="center"/>
-    </w:pPr>
-    <w:rPr>
-      <w:rFonts w:asciiTheme="majorHAnsi" w:cstheme="majorBidi" w:eastAsiaTheme="majorEastAsia" w:hAnsiTheme="majorHAnsi"/>
-      <w:sz w:val="56"/>
-      <w:szCs w:val="56"/>
-    </w:rPr>
-  </w:style>
-  <w:style w:customStyle="1" w:styleId="TitleChar" w:type="character">
-    <w:name w:val="Title Char"/>
-    <w:basedOn w:val="DefaultParagraphFont"/>
-    <w:link w:val="Title"/>
-    <w:uiPriority w:val="10"/>
-    <w:rsid w:val="00A10FD9"/>
-    <w:rPr>
-      <w:rFonts w:asciiTheme="majorHAnsi" w:cstheme="majorBidi" w:eastAsiaTheme="majorEastAsia" w:hAnsiTheme="majorHAnsi"/>
-      <w:sz w:val="56"/>
-      <w:szCs w:val="56"/>
-    </w:rPr>
-  </w:style>
-  <w:style w:styleId="Subtitle" w:type="paragraph">
-    <w:name w:val="Subtitle"/>
-    <w:basedOn w:val="Title"/>
-    <w:next w:val="BodyText"/>
-    <w:link w:val="SubtitleChar"/>
-    <w:uiPriority w:val="11"/>
-    <w:qFormat/>
-    <w:rsid w:val="00A10FD9"/>
-    <w:pPr>
-      <w:numPr>
-        <w:ilvl w:val="1"/>
-      </w:numPr>
-    </w:pPr>
-    <w:rPr>
-      <w:rFonts w:cstheme="majorBidi" w:eastAsiaTheme="majorEastAsia"/>
-      <w:spacing w:val="15"/>
-      <w:sz w:val="28"/>
-      <w:szCs w:val="28"/>
-    </w:rPr>
-  </w:style>
-  <w:style w:customStyle="1" w:styleId="SubtitleChar" w:type="character">
-    <w:name w:val="Subtitle Char"/>
-    <w:basedOn w:val="DefaultParagraphFont"/>
-    <w:link w:val="Subtitle"/>
-    <w:uiPriority w:val="11"/>
-    <w:rsid w:val="00A10FD9"/>
-    <w:rPr>
-      <w:rFonts w:cstheme="majorBidi" w:eastAsiaTheme="majorEastAsia"/>
-      <w:color w:themeColor="text1" w:themeTint="A6" w:val="595959"/>
-      <w:spacing w:val="15"/>
-      <w:sz w:val="28"/>
-      <w:szCs w:val="28"/>
-    </w:rPr>
-  </w:style>
-  <w:style w:customStyle="1" w:styleId="Author" w:type="paragraph">
-    <w:name w:val="Author"/>
-    <w:basedOn w:val="Title"/>
-    <w:next w:val="BodyText"/>
-    <w:qFormat/>
-    <w:pPr>
-      <w:keepNext/>
-      <w:keepLines/>
-    </w:pPr>
-    <w:rPr>
-      <w:sz w:val="24"/>
-      <w:szCs w:val="24"/>
-    </w:rPr>
-  </w:style>
-  <w:style w:styleId="Date" w:type="paragraph">
-    <w:name w:val="Date"/>
-    <w:basedOn w:val="Title"/>
-    <w:next w:val="BodyText"/>
-    <w:qFormat/>
-    <w:pPr>
-      <w:keepNext/>
-      <w:keepLines/>
-    </w:pPr>
-    <w:rPr>
-      <w:sz w:val="24"/>
-      <w:szCs w:val="24"/>
-    </w:rPr>
-  </w:style>
-  <w:style w:customStyle="1" w:styleId="AbstractTitle" w:type="paragraph">
-    <w:name w:val="Abstract Title"/>
-    <w:basedOn w:val="Normal"/>
-    <w:next w:val="Abstract"/>
-    <w:qFormat/>
-    <w:pPr>
-      <w:keepNext/>
-      <w:keepLines/>
-      <w:spacing w:after="0" w:before="300"/>
-      <w:jc w:val="center"/>
-    </w:pPr>
-    <w:rPr>
-      <w:b/>
-      <w:sz w:val="20"/>
-      <w:szCs w:val="20"/>
-    </w:rPr>
-  </w:style>
-  <w:style w:customStyle="1" w:styleId="Abstract" w:type="paragraph">
-    <w:name w:val="Abstract"/>
-    <w:basedOn w:val="Normal"/>
-    <w:next w:val="BodyText"/>
-    <w:qFormat/>
-    <w:pPr>
-      <w:keepNext/>
-      <w:keepLines/>
-      <w:spacing w:after="300" w:before="100"/>
-    </w:pPr>
-    <w:rPr>
-      <w:sz w:val="20"/>
-      <w:szCs w:val="20"/>
-    </w:rPr>
-  </w:style>
-  <w:style w:styleId="Bibliography" w:type="paragraph">
-    <w:name w:val="Bibliography"/>
-    <w:basedOn w:val="Normal"/>
-    <w:next w:val="Bibliography"/>
-    <w:qFormat/>
-    <w:pPr/>
-    <w:rPr/>
-  </w:style>
-  <w:style w:styleId="Heading1" w:type="paragraph">
+  <w:style w:type="paragraph" w:styleId="Heading1">
     <w:name w:val="heading 1"/>
     <w:basedOn w:val="Normal"/>
     <w:next w:val="BodyText"/>
@@ -2322,17 +2331,17 @@
     <w:pPr>
       <w:keepNext/>
       <w:keepLines/>
-      <w:spacing w:after="80" w:before="360"/>
+      <w:spacing w:before="360" w:after="80"/>
       <w:outlineLvl w:val="0"/>
     </w:pPr>
     <w:rPr>
-      <w:rFonts w:asciiTheme="majorHAnsi" w:cstheme="majorBidi" w:eastAsiaTheme="majorEastAsia" w:hAnsiTheme="majorHAnsi"/>
-      <w:color w:themeColor="accent1" w:themeShade="BF" w:val="0F4761"/>
+      <w:rFonts w:asciiTheme="majorHAnsi" w:eastAsiaTheme="majorEastAsia" w:hAnsiTheme="majorHAnsi" w:cstheme="majorBidi"/>
+      <w:color w:val="0F4761" w:themeColor="accent1" w:themeShade="BF"/>
       <w:sz w:val="40"/>
       <w:szCs w:val="40"/>
     </w:rPr>
   </w:style>
-  <w:style w:styleId="Heading2" w:type="paragraph">
+  <w:style w:type="paragraph" w:styleId="Heading2">
     <w:name w:val="heading 2"/>
     <w:basedOn w:val="Normal"/>
     <w:next w:val="BodyText"/>
@@ -2345,17 +2354,17 @@
     <w:pPr>
       <w:keepNext/>
       <w:keepLines/>
-      <w:spacing w:after="80" w:before="160"/>
+      <w:spacing w:before="160" w:after="80"/>
       <w:outlineLvl w:val="1"/>
     </w:pPr>
     <w:rPr>
-      <w:rFonts w:asciiTheme="majorHAnsi" w:cstheme="majorBidi" w:eastAsiaTheme="majorEastAsia" w:hAnsiTheme="majorHAnsi"/>
-      <w:color w:themeColor="accent1" w:themeShade="BF" w:val="0F4761"/>
+      <w:rFonts w:asciiTheme="majorHAnsi" w:eastAsiaTheme="majorEastAsia" w:hAnsiTheme="majorHAnsi" w:cstheme="majorBidi"/>
+      <w:color w:val="0F4761" w:themeColor="accent1" w:themeShade="BF"/>
       <w:sz w:val="32"/>
       <w:szCs w:val="32"/>
     </w:rPr>
   </w:style>
-  <w:style w:styleId="Heading3" w:type="paragraph">
+  <w:style w:type="paragraph" w:styleId="Heading3">
     <w:name w:val="heading 3"/>
     <w:basedOn w:val="Normal"/>
     <w:next w:val="BodyText"/>
@@ -2368,17 +2377,17 @@
     <w:pPr>
       <w:keepNext/>
       <w:keepLines/>
-      <w:spacing w:after="80" w:before="160"/>
+      <w:spacing w:before="160" w:after="80"/>
       <w:outlineLvl w:val="2"/>
     </w:pPr>
     <w:rPr>
-      <w:rFonts w:cstheme="majorBidi" w:eastAsiaTheme="majorEastAsia"/>
-      <w:color w:themeColor="accent1" w:themeShade="BF" w:val="0F4761"/>
+      <w:rFonts w:eastAsiaTheme="majorEastAsia" w:cstheme="majorBidi"/>
+      <w:color w:val="0F4761" w:themeColor="accent1" w:themeShade="BF"/>
       <w:sz w:val="28"/>
       <w:szCs w:val="28"/>
     </w:rPr>
   </w:style>
-  <w:style w:styleId="Heading4" w:type="paragraph">
+  <w:style w:type="paragraph" w:styleId="Heading4">
     <w:name w:val="heading 4"/>
     <w:basedOn w:val="Normal"/>
     <w:next w:val="BodyText"/>
@@ -2391,17 +2400,17 @@
     <w:pPr>
       <w:keepNext/>
       <w:keepLines/>
-      <w:spacing w:after="40" w:before="80"/>
+      <w:spacing w:before="80" w:after="40"/>
       <w:outlineLvl w:val="3"/>
     </w:pPr>
     <w:rPr>
-      <w:rFonts w:cstheme="majorBidi" w:eastAsiaTheme="majorEastAsia"/>
+      <w:rFonts w:eastAsiaTheme="majorEastAsia" w:cstheme="majorBidi"/>
       <w:i/>
       <w:iCs/>
-      <w:color w:themeColor="accent1" w:themeShade="BF" w:val="0F4761"/>
-    </w:rPr>
-  </w:style>
-  <w:style w:styleId="Heading5" w:type="paragraph">
+      <w:color w:val="0F4761" w:themeColor="accent1" w:themeShade="BF"/>
+    </w:rPr>
+  </w:style>
+  <w:style w:type="paragraph" w:styleId="Heading5">
     <w:name w:val="heading 5"/>
     <w:basedOn w:val="Normal"/>
     <w:next w:val="BodyText"/>
@@ -2414,15 +2423,15 @@
     <w:pPr>
       <w:keepNext/>
       <w:keepLines/>
-      <w:spacing w:after="40" w:before="80"/>
+      <w:spacing w:before="80" w:after="40"/>
       <w:outlineLvl w:val="4"/>
     </w:pPr>
     <w:rPr>
-      <w:rFonts w:cstheme="majorBidi" w:eastAsiaTheme="majorEastAsia"/>
-      <w:color w:themeColor="accent1" w:themeShade="BF" w:val="0F4761"/>
-    </w:rPr>
-  </w:style>
-  <w:style w:styleId="Heading6" w:type="paragraph">
+      <w:rFonts w:eastAsiaTheme="majorEastAsia" w:cstheme="majorBidi"/>
+      <w:color w:val="0F4761" w:themeColor="accent1" w:themeShade="BF"/>
+    </w:rPr>
+  </w:style>
+  <w:style w:type="paragraph" w:styleId="Heading6">
     <w:name w:val="heading 6"/>
     <w:basedOn w:val="Normal"/>
     <w:next w:val="BodyText"/>
@@ -2435,17 +2444,17 @@
     <w:pPr>
       <w:keepNext/>
       <w:keepLines/>
-      <w:spacing w:after="0" w:before="40"/>
+      <w:spacing w:before="40" w:after="0"/>
       <w:outlineLvl w:val="5"/>
     </w:pPr>
     <w:rPr>
-      <w:rFonts w:cstheme="majorBidi" w:eastAsiaTheme="majorEastAsia"/>
+      <w:rFonts w:eastAsiaTheme="majorEastAsia" w:cstheme="majorBidi"/>
       <w:i/>
       <w:iCs/>
-      <w:color w:themeColor="text1" w:themeTint="A6" w:val="595959"/>
-    </w:rPr>
-  </w:style>
-  <w:style w:styleId="Heading7" w:type="paragraph">
+      <w:color w:val="595959" w:themeColor="text1" w:themeTint="A6"/>
+    </w:rPr>
+  </w:style>
+  <w:style w:type="paragraph" w:styleId="Heading7">
     <w:name w:val="heading 7"/>
     <w:basedOn w:val="Normal"/>
     <w:next w:val="BodyText"/>
@@ -2458,15 +2467,15 @@
     <w:pPr>
       <w:keepNext/>
       <w:keepLines/>
-      <w:spacing w:after="0" w:before="40"/>
+      <w:spacing w:before="40" w:after="0"/>
       <w:outlineLvl w:val="6"/>
     </w:pPr>
     <w:rPr>
-      <w:rFonts w:cstheme="majorBidi" w:eastAsiaTheme="majorEastAsia"/>
-      <w:color w:themeColor="text1" w:themeTint="A6" w:val="595959"/>
-    </w:rPr>
-  </w:style>
-  <w:style w:styleId="Heading8" w:type="paragraph">
+      <w:rFonts w:eastAsiaTheme="majorEastAsia" w:cstheme="majorBidi"/>
+      <w:color w:val="595959" w:themeColor="text1" w:themeTint="A6"/>
+    </w:rPr>
+  </w:style>
+  <w:style w:type="paragraph" w:styleId="Heading8">
     <w:name w:val="heading 8"/>
     <w:basedOn w:val="Normal"/>
     <w:next w:val="BodyText"/>
@@ -2483,13 +2492,13 @@
       <w:outlineLvl w:val="7"/>
     </w:pPr>
     <w:rPr>
-      <w:rFonts w:cstheme="majorBidi" w:eastAsiaTheme="majorEastAsia"/>
+      <w:rFonts w:eastAsiaTheme="majorEastAsia" w:cstheme="majorBidi"/>
       <w:i/>
       <w:iCs/>
-      <w:color w:themeColor="text1" w:themeTint="D8" w:val="272727"/>
-    </w:rPr>
-  </w:style>
-  <w:style w:styleId="Heading9" w:type="paragraph">
+      <w:color w:val="272727" w:themeColor="text1" w:themeTint="D8"/>
+    </w:rPr>
+  </w:style>
+  <w:style w:type="paragraph" w:styleId="Heading9">
     <w:name w:val="heading 9"/>
     <w:basedOn w:val="Normal"/>
     <w:next w:val="BodyText"/>
@@ -2506,24 +2515,202 @@
       <w:outlineLvl w:val="8"/>
     </w:pPr>
     <w:rPr>
-      <w:rFonts w:cstheme="majorBidi" w:eastAsiaTheme="majorEastAsia"/>
-      <w:color w:themeColor="text1" w:themeTint="D8" w:val="272727"/>
-    </w:rPr>
-  </w:style>
-  <w:style w:customStyle="1" w:styleId="Heading1Char" w:type="character">
+      <w:rFonts w:eastAsiaTheme="majorEastAsia" w:cstheme="majorBidi"/>
+      <w:color w:val="272727" w:themeColor="text1" w:themeTint="D8"/>
+    </w:rPr>
+  </w:style>
+  <w:style w:type="character" w:default="1" w:styleId="DefaultParagraphFont">
+    <w:name w:val="Default Paragraph Font"/>
+    <w:uiPriority w:val="1"/>
+    <w:semiHidden/>
+    <w:unhideWhenUsed/>
+  </w:style>
+  <w:style w:type="table" w:default="1" w:styleId="TableNormal">
+    <w:name w:val="Normal Table"/>
+    <w:uiPriority w:val="99"/>
+    <w:semiHidden/>
+    <w:unhideWhenUsed/>
+    <w:tblPr>
+      <w:tblInd w:w="0" w:type="dxa"/>
+      <w:tblCellMar>
+        <w:top w:w="0" w:type="dxa"/>
+        <w:left w:w="108" w:type="dxa"/>
+        <w:bottom w:w="0" w:type="dxa"/>
+        <w:right w:w="108" w:type="dxa"/>
+      </w:tblCellMar>
+    </w:tblPr>
+  </w:style>
+  <w:style w:type="numbering" w:default="1" w:styleId="NoList">
+    <w:name w:val="No List"/>
+    <w:uiPriority w:val="99"/>
+    <w:semiHidden/>
+    <w:unhideWhenUsed/>
+  </w:style>
+  <w:style w:type="paragraph" w:styleId="BodyText">
+    <w:name w:val="Body Text"/>
+    <w:basedOn w:val="Normal"/>
+    <w:qFormat/>
+    <w:pPr>
+      <w:spacing w:before="180" w:after="180"/>
+    </w:pPr>
+  </w:style>
+  <w:style w:type="paragraph" w:customStyle="1" w:styleId="FirstParagraph">
+    <w:name w:val="First Paragraph"/>
+    <w:basedOn w:val="BodyText"/>
+    <w:next w:val="BodyText"/>
+    <w:qFormat/>
+  </w:style>
+  <w:style w:type="paragraph" w:customStyle="1" w:styleId="Compact">
+    <w:name w:val="Compact"/>
+    <w:basedOn w:val="BodyText"/>
+    <w:qFormat/>
+    <w:pPr>
+      <w:spacing w:before="36" w:after="36"/>
+    </w:pPr>
+  </w:style>
+  <w:style w:type="paragraph" w:styleId="Title">
+    <w:name w:val="Title"/>
+    <w:basedOn w:val="Normal"/>
+    <w:next w:val="BodyText"/>
+    <w:link w:val="TitleChar"/>
+    <w:uiPriority w:val="10"/>
+    <w:qFormat/>
+    <w:rsid w:val="00A10FD9"/>
+    <w:pPr>
+      <w:spacing w:after="80"/>
+      <w:contextualSpacing/>
+      <w:jc w:val="center"/>
+    </w:pPr>
+    <w:rPr>
+      <w:rFonts w:asciiTheme="majorHAnsi" w:eastAsiaTheme="majorEastAsia" w:hAnsiTheme="majorHAnsi" w:cstheme="majorBidi"/>
+      <w:sz w:val="56"/>
+      <w:szCs w:val="56"/>
+    </w:rPr>
+  </w:style>
+  <w:style w:type="character" w:customStyle="1" w:styleId="TitleChar">
+    <w:name w:val="Title Char"/>
+    <w:basedOn w:val="DefaultParagraphFont"/>
+    <w:link w:val="Title"/>
+    <w:uiPriority w:val="10"/>
+    <w:rsid w:val="00A10FD9"/>
+    <w:rPr>
+      <w:rFonts w:asciiTheme="majorHAnsi" w:eastAsiaTheme="majorEastAsia" w:hAnsiTheme="majorHAnsi" w:cstheme="majorBidi"/>
+      <w:sz w:val="56"/>
+      <w:szCs w:val="56"/>
+    </w:rPr>
+  </w:style>
+  <w:style w:type="paragraph" w:styleId="Subtitle">
+    <w:name w:val="Subtitle"/>
+    <w:basedOn w:val="Title"/>
+    <w:next w:val="BodyText"/>
+    <w:link w:val="SubtitleChar"/>
+    <w:uiPriority w:val="11"/>
+    <w:qFormat/>
+    <w:rsid w:val="00A10FD9"/>
+    <w:pPr>
+      <w:numPr>
+        <w:ilvl w:val="1"/>
+      </w:numPr>
+    </w:pPr>
+    <w:rPr>
+      <w:spacing w:val="15"/>
+      <w:sz w:val="28"/>
+      <w:szCs w:val="28"/>
+    </w:rPr>
+  </w:style>
+  <w:style w:type="character" w:customStyle="1" w:styleId="SubtitleChar">
+    <w:name w:val="Subtitle Char"/>
+    <w:basedOn w:val="DefaultParagraphFont"/>
+    <w:link w:val="Subtitle"/>
+    <w:uiPriority w:val="11"/>
+    <w:rsid w:val="00A10FD9"/>
+    <w:rPr>
+      <w:rFonts w:eastAsiaTheme="majorEastAsia" w:cstheme="majorBidi"/>
+      <w:color w:val="595959" w:themeColor="text1" w:themeTint="A6"/>
+      <w:spacing w:val="15"/>
+      <w:sz w:val="28"/>
+      <w:szCs w:val="28"/>
+    </w:rPr>
+  </w:style>
+  <w:style w:type="paragraph" w:customStyle="1" w:styleId="Author">
+    <w:name w:val="Author"/>
+    <w:basedOn w:val="Title"/>
+    <w:next w:val="BodyText"/>
+    <w:qFormat/>
+    <w:pPr>
+      <w:keepNext/>
+      <w:keepLines/>
+    </w:pPr>
+    <w:rPr>
+      <w:sz w:val="24"/>
+      <w:szCs w:val="24"/>
+    </w:rPr>
+  </w:style>
+  <w:style w:type="paragraph" w:styleId="Date">
+    <w:name w:val="Date"/>
+    <w:basedOn w:val="Title"/>
+    <w:next w:val="BodyText"/>
+    <w:qFormat/>
+    <w:pPr>
+      <w:keepNext/>
+      <w:keepLines/>
+    </w:pPr>
+    <w:rPr>
+      <w:sz w:val="24"/>
+      <w:szCs w:val="24"/>
+    </w:rPr>
+  </w:style>
+  <w:style w:type="paragraph" w:customStyle="1" w:styleId="AbstractTitle">
+    <w:name w:val="Abstract Title"/>
+    <w:basedOn w:val="Normal"/>
+    <w:next w:val="Abstract"/>
+    <w:qFormat/>
+    <w:pPr>
+      <w:keepNext/>
+      <w:keepLines/>
+      <w:spacing w:before="300" w:after="0"/>
+      <w:jc w:val="center"/>
+    </w:pPr>
+    <w:rPr>
+      <w:b/>
+      <w:sz w:val="20"/>
+      <w:szCs w:val="20"/>
+    </w:rPr>
+  </w:style>
+  <w:style w:type="paragraph" w:customStyle="1" w:styleId="Abstract">
+    <w:name w:val="Abstract"/>
+    <w:basedOn w:val="Normal"/>
+    <w:next w:val="BodyText"/>
+    <w:qFormat/>
+    <w:pPr>
+      <w:keepNext/>
+      <w:keepLines/>
+      <w:spacing w:before="100" w:after="300"/>
+    </w:pPr>
+    <w:rPr>
+      <w:sz w:val="20"/>
+      <w:szCs w:val="20"/>
+    </w:rPr>
+  </w:style>
+  <w:style w:type="paragraph" w:styleId="Bibliography">
+    <w:name w:val="Bibliography"/>
+    <w:basedOn w:val="Normal"/>
+    <w:qFormat/>
+  </w:style>
+  <w:style w:type="character" w:customStyle="1" w:styleId="Heading1Char">
     <w:name w:val="Heading 1 Char"/>
     <w:basedOn w:val="DefaultParagraphFont"/>
     <w:link w:val="Heading1"/>
     <w:uiPriority w:val="9"/>
     <w:rsid w:val="00A10FD9"/>
     <w:rPr>
-      <w:rFonts w:asciiTheme="majorHAnsi" w:cstheme="majorBidi" w:eastAsiaTheme="majorEastAsia" w:hAnsiTheme="majorHAnsi"/>
-      <w:color w:themeColor="accent1" w:themeShade="BF" w:val="0F4761"/>
+      <w:rFonts w:asciiTheme="majorHAnsi" w:eastAsiaTheme="majorEastAsia" w:hAnsiTheme="majorHAnsi" w:cstheme="majorBidi"/>
+      <w:color w:val="0F4761" w:themeColor="accent1" w:themeShade="BF"/>
       <w:sz w:val="40"/>
       <w:szCs w:val="40"/>
     </w:rPr>
   </w:style>
-  <w:style w:customStyle="1" w:styleId="Heading2Char" w:type="character">
+  <w:style w:type="character" w:customStyle="1" w:styleId="Heading2Char">
     <w:name w:val="Heading 2 Char"/>
     <w:basedOn w:val="DefaultParagraphFont"/>
     <w:link w:val="Heading2"/>
@@ -2531,13 +2718,13 @@
     <w:semiHidden/>
     <w:rsid w:val="00A10FD9"/>
     <w:rPr>
-      <w:rFonts w:asciiTheme="majorHAnsi" w:cstheme="majorBidi" w:eastAsiaTheme="majorEastAsia" w:hAnsiTheme="majorHAnsi"/>
-      <w:color w:themeColor="accent1" w:themeShade="BF" w:val="0F4761"/>
+      <w:rFonts w:asciiTheme="majorHAnsi" w:eastAsiaTheme="majorEastAsia" w:hAnsiTheme="majorHAnsi" w:cstheme="majorBidi"/>
+      <w:color w:val="0F4761" w:themeColor="accent1" w:themeShade="BF"/>
       <w:sz w:val="32"/>
       <w:szCs w:val="32"/>
     </w:rPr>
   </w:style>
-  <w:style w:customStyle="1" w:styleId="Heading3Char" w:type="character">
+  <w:style w:type="character" w:customStyle="1" w:styleId="Heading3Char">
     <w:name w:val="Heading 3 Char"/>
     <w:basedOn w:val="DefaultParagraphFont"/>
     <w:link w:val="Heading3"/>
@@ -2545,13 +2732,13 @@
     <w:semiHidden/>
     <w:rsid w:val="00A10FD9"/>
     <w:rPr>
-      <w:rFonts w:cstheme="majorBidi" w:eastAsiaTheme="majorEastAsia"/>
-      <w:color w:themeColor="accent1" w:themeShade="BF" w:val="0F4761"/>
+      <w:rFonts w:eastAsiaTheme="majorEastAsia" w:cstheme="majorBidi"/>
+      <w:color w:val="0F4761" w:themeColor="accent1" w:themeShade="BF"/>
       <w:sz w:val="28"/>
       <w:szCs w:val="28"/>
     </w:rPr>
   </w:style>
-  <w:style w:customStyle="1" w:styleId="Heading4Char" w:type="character">
+  <w:style w:type="character" w:customStyle="1" w:styleId="Heading4Char">
     <w:name w:val="Heading 4 Char"/>
     <w:basedOn w:val="DefaultParagraphFont"/>
     <w:link w:val="Heading4"/>
@@ -2559,13 +2746,13 @@
     <w:semiHidden/>
     <w:rsid w:val="00A10FD9"/>
     <w:rPr>
-      <w:rFonts w:cstheme="majorBidi" w:eastAsiaTheme="majorEastAsia"/>
+      <w:rFonts w:eastAsiaTheme="majorEastAsia" w:cstheme="majorBidi"/>
       <w:i/>
       <w:iCs/>
-      <w:color w:themeColor="accent1" w:themeShade="BF" w:val="0F4761"/>
-    </w:rPr>
-  </w:style>
-  <w:style w:customStyle="1" w:styleId="Heading5Char" w:type="character">
+      <w:color w:val="0F4761" w:themeColor="accent1" w:themeShade="BF"/>
+    </w:rPr>
+  </w:style>
+  <w:style w:type="character" w:customStyle="1" w:styleId="Heading5Char">
     <w:name w:val="Heading 5 Char"/>
     <w:basedOn w:val="DefaultParagraphFont"/>
     <w:link w:val="Heading5"/>
@@ -2573,11 +2760,11 @@
     <w:semiHidden/>
     <w:rsid w:val="00A10FD9"/>
     <w:rPr>
-      <w:rFonts w:cstheme="majorBidi" w:eastAsiaTheme="majorEastAsia"/>
-      <w:color w:themeColor="accent1" w:themeShade="BF" w:val="0F4761"/>
-    </w:rPr>
-  </w:style>
-  <w:style w:customStyle="1" w:styleId="Heading6Char" w:type="character">
+      <w:rFonts w:eastAsiaTheme="majorEastAsia" w:cstheme="majorBidi"/>
+      <w:color w:val="0F4761" w:themeColor="accent1" w:themeShade="BF"/>
+    </w:rPr>
+  </w:style>
+  <w:style w:type="character" w:customStyle="1" w:styleId="Heading6Char">
     <w:name w:val="Heading 6 Char"/>
     <w:basedOn w:val="DefaultParagraphFont"/>
     <w:link w:val="Heading6"/>
@@ -2585,13 +2772,13 @@
     <w:semiHidden/>
     <w:rsid w:val="00A10FD9"/>
     <w:rPr>
-      <w:rFonts w:cstheme="majorBidi" w:eastAsiaTheme="majorEastAsia"/>
+      <w:rFonts w:eastAsiaTheme="majorEastAsia" w:cstheme="majorBidi"/>
       <w:i/>
       <w:iCs/>
-      <w:color w:themeColor="text1" w:themeTint="A6" w:val="595959"/>
-    </w:rPr>
-  </w:style>
-  <w:style w:customStyle="1" w:styleId="Heading7Char" w:type="character">
+      <w:color w:val="595959" w:themeColor="text1" w:themeTint="A6"/>
+    </w:rPr>
+  </w:style>
+  <w:style w:type="character" w:customStyle="1" w:styleId="Heading7Char">
     <w:name w:val="Heading 7 Char"/>
     <w:basedOn w:val="DefaultParagraphFont"/>
     <w:link w:val="Heading7"/>
@@ -2599,11 +2786,11 @@
     <w:semiHidden/>
     <w:rsid w:val="00A10FD9"/>
     <w:rPr>
-      <w:rFonts w:cstheme="majorBidi" w:eastAsiaTheme="majorEastAsia"/>
-      <w:color w:themeColor="text1" w:themeTint="A6" w:val="595959"/>
-    </w:rPr>
-  </w:style>
-  <w:style w:customStyle="1" w:styleId="Heading8Char" w:type="character">
+      <w:rFonts w:eastAsiaTheme="majorEastAsia" w:cstheme="majorBidi"/>
+      <w:color w:val="595959" w:themeColor="text1" w:themeTint="A6"/>
+    </w:rPr>
+  </w:style>
+  <w:style w:type="character" w:customStyle="1" w:styleId="Heading8Char">
     <w:name w:val="Heading 8 Char"/>
     <w:basedOn w:val="DefaultParagraphFont"/>
     <w:link w:val="Heading8"/>
@@ -2611,13 +2798,13 @@
     <w:semiHidden/>
     <w:rsid w:val="00A10FD9"/>
     <w:rPr>
-      <w:rFonts w:cstheme="majorBidi" w:eastAsiaTheme="majorEastAsia"/>
+      <w:rFonts w:eastAsiaTheme="majorEastAsia" w:cstheme="majorBidi"/>
       <w:i/>
       <w:iCs/>
-      <w:color w:themeColor="text1" w:themeTint="D8" w:val="272727"/>
-    </w:rPr>
-  </w:style>
-  <w:style w:customStyle="1" w:styleId="Heading9Char" w:type="character">
+      <w:color w:val="272727" w:themeColor="text1" w:themeTint="D8"/>
+    </w:rPr>
+  </w:style>
+  <w:style w:type="character" w:customStyle="1" w:styleId="Heading9Char">
     <w:name w:val="Heading 9 Char"/>
     <w:basedOn w:val="DefaultParagraphFont"/>
     <w:link w:val="Heading9"/>
@@ -2625,11 +2812,11 @@
     <w:semiHidden/>
     <w:rsid w:val="00A10FD9"/>
     <w:rPr>
-      <w:rFonts w:cstheme="majorBidi" w:eastAsiaTheme="majorEastAsia"/>
-      <w:color w:themeColor="text1" w:themeTint="D8" w:val="272727"/>
-    </w:rPr>
-  </w:style>
-  <w:style w:styleId="BlockText" w:type="paragraph">
+      <w:rFonts w:eastAsiaTheme="majorEastAsia" w:cstheme="majorBidi"/>
+      <w:color w:val="272727" w:themeColor="text1" w:themeTint="D8"/>
+    </w:rPr>
+  </w:style>
+  <w:style w:type="paragraph" w:styleId="BlockText">
     <w:name w:val="Block Text"/>
     <w:basedOn w:val="BodyText"/>
     <w:next w:val="BodyText"/>
@@ -2637,19 +2824,18 @@
     <w:unhideWhenUsed/>
     <w:qFormat/>
     <w:pPr>
-      <w:spacing w:after="100" w:before="100"/>
-      <w:ind w:firstLine="0" w:left="480" w:right="480"/>
+      <w:spacing w:before="100" w:after="100"/>
+      <w:ind w:left="480" w:right="480"/>
     </w:pPr>
   </w:style>
-  <w:style w:styleId="FootnoteText" w:type="paragraph">
-    <w:name w:val="Footnote Text"/>
+  <w:style w:type="paragraph" w:styleId="FootnoteText">
+    <w:name w:val="footnote text"/>
     <w:basedOn w:val="Normal"/>
-    <w:next w:val="FootnoteText"/>
     <w:uiPriority w:val="9"/>
     <w:unhideWhenUsed/>
     <w:qFormat/>
   </w:style>
-  <w:style w:styleId="FootnoteBlockText" w:type="paragraph">
+  <w:style w:type="paragraph" w:customStyle="1" w:styleId="FootnoteBlockText">
     <w:name w:val="Footnote Block Text"/>
     <w:basedOn w:val="FootnoteText"/>
     <w:next w:val="FootnoteText"/>
@@ -2657,40 +2843,35 @@
     <w:unhideWhenUsed/>
     <w:qFormat/>
     <w:pPr>
-      <w:spacing w:after="100" w:before="100"/>
-      <w:ind w:firstLine="0" w:left="480" w:right="480"/>
+      <w:spacing w:before="100" w:after="100"/>
+      <w:ind w:left="480" w:right="480"/>
     </w:pPr>
   </w:style>
-  <w:style w:default="1" w:styleId="DefaultParagraphFont" w:type="character">
-    <w:name w:val="Default Paragraph Font"/>
-    <w:semiHidden/>
-    <w:unhideWhenUsed/>
-  </w:style>
-  <w:style w:default="1" w:styleId="Table" w:type="table">
+  <w:style w:type="table" w:customStyle="1" w:styleId="Table">
     <w:name w:val="Table"/>
-    <w:basedOn w:val="TableNormal"/>
     <w:semiHidden/>
     <w:unhideWhenUsed/>
     <w:qFormat/>
     <w:tblPr>
-      <w:tblInd w:type="dxa" w:w="0"/>
+      <w:tblInd w:w="0" w:type="dxa"/>
       <w:tblCellMar>
-        <w:top w:type="dxa" w:w="0"/>
-        <w:left w:type="dxa" w:w="108"/>
-        <w:bottom w:type="dxa" w:w="0"/>
-        <w:right w:type="dxa" w:w="108"/>
+        <w:top w:w="0" w:type="dxa"/>
+        <w:left w:w="108" w:type="dxa"/>
+        <w:bottom w:w="0" w:type="dxa"/>
+        <w:right w:w="108" w:type="dxa"/>
       </w:tblCellMar>
     </w:tblPr>
     <w:tblStylePr w:type="firstRow">
+      <w:tblPr/>
       <w:tcPr>
         <w:tcBorders>
-          <w:bottom w:val="single"/>
+          <w:bottom w:val="single" w:sz="0" w:space="0" w:color="auto"/>
         </w:tcBorders>
         <w:vAlign w:val="bottom"/>
       </w:tcPr>
     </w:tblStylePr>
   </w:style>
-  <w:style w:customStyle="1" w:styleId="DefinitionTerm" w:type="paragraph">
+  <w:style w:type="paragraph" w:customStyle="1" w:styleId="DefinitionTerm">
     <w:name w:val="Definition Term"/>
     <w:basedOn w:val="Normal"/>
     <w:next w:val="Definition"/>
@@ -2703,75 +2884,76 @@
       <w:b/>
     </w:rPr>
   </w:style>
-  <w:style w:customStyle="1" w:styleId="Definition" w:type="paragraph">
+  <w:style w:type="paragraph" w:customStyle="1" w:styleId="Definition">
     <w:name w:val="Definition"/>
     <w:basedOn w:val="Normal"/>
   </w:style>
-  <w:style w:styleId="Caption" w:type="paragraph">
-    <w:name w:val="Caption"/>
+  <w:style w:type="paragraph" w:styleId="Caption">
+    <w:name w:val="caption"/>
     <w:basedOn w:val="Normal"/>
-    <w:link w:val="BodyTextChar"/>
+    <w:link w:val="CaptionChar"/>
     <w:pPr>
-      <w:spacing w:after="120" w:before="0"/>
+      <w:spacing w:after="120"/>
     </w:pPr>
     <w:rPr>
       <w:i/>
     </w:rPr>
   </w:style>
-  <w:style w:customStyle="1" w:styleId="TableCaption" w:type="paragraph">
+  <w:style w:type="paragraph" w:customStyle="1" w:styleId="TableCaption">
     <w:name w:val="Table Caption"/>
     <w:basedOn w:val="Caption"/>
     <w:pPr>
       <w:keepNext/>
     </w:pPr>
   </w:style>
-  <w:style w:customStyle="1" w:styleId="ImageCaption" w:type="paragraph">
+  <w:style w:type="paragraph" w:customStyle="1" w:styleId="ImageCaption">
     <w:name w:val="Image Caption"/>
     <w:basedOn w:val="Caption"/>
   </w:style>
-  <w:style w:customStyle="1" w:styleId="Figure" w:type="paragraph">
+  <w:style w:type="paragraph" w:customStyle="1" w:styleId="Figure">
     <w:name w:val="Figure"/>
     <w:basedOn w:val="Normal"/>
   </w:style>
-  <w:style w:customStyle="1" w:styleId="CaptionedFigure" w:type="paragraph">
+  <w:style w:type="paragraph" w:customStyle="1" w:styleId="CaptionedFigure">
     <w:name w:val="Captioned Figure"/>
     <w:basedOn w:val="Figure"/>
     <w:pPr>
       <w:keepNext/>
     </w:pPr>
   </w:style>
-  <w:style w:customStyle="1" w:styleId="BodyTextChar" w:type="character">
-    <w:name w:val="Body Text Char"/>
+  <w:style w:type="character" w:customStyle="1" w:styleId="CaptionChar">
+    <w:name w:val="Caption Char"/>
     <w:basedOn w:val="DefaultParagraphFont"/>
-    <w:link w:val="BodyText"/>
-  </w:style>
-  <w:style w:customStyle="1" w:styleId="VerbatimChar" w:type="character">
+    <w:link w:val="Caption"/>
+  </w:style>
+  <w:style w:type="character" w:customStyle="1" w:styleId="VerbatimChar">
     <w:name w:val="Verbatim Char"/>
-    <w:basedOn w:val="BodyTextChar"/>
+    <w:basedOn w:val="CaptionChar"/>
+    <w:link w:val="SourceCode"/>
     <w:rPr>
       <w:rFonts w:ascii="Consolas" w:hAnsi="Consolas"/>
       <w:sz w:val="22"/>
     </w:rPr>
   </w:style>
-  <w:style w:customStyle="1" w:styleId="SectionNumber" w:type="character">
+  <w:style w:type="character" w:customStyle="1" w:styleId="SectionNumber">
     <w:name w:val="Section Number"/>
-    <w:basedOn w:val="BodyTextChar"/>
-  </w:style>
-  <w:style w:styleId="FootnoteReference" w:type="character">
-    <w:name w:val="Footnote Reference"/>
-    <w:basedOn w:val="BodyTextChar"/>
+    <w:basedOn w:val="CaptionChar"/>
+  </w:style>
+  <w:style w:type="character" w:styleId="FootnoteReference">
+    <w:name w:val="footnote reference"/>
+    <w:basedOn w:val="CaptionChar"/>
     <w:rPr>
       <w:vertAlign w:val="superscript"/>
     </w:rPr>
   </w:style>
-  <w:style w:styleId="Hyperlink" w:type="character">
+  <w:style w:type="character" w:styleId="Hyperlink">
     <w:name w:val="Hyperlink"/>
-    <w:basedOn w:val="BodyTextChar"/>
-    <w:rPr>
-      <w:color w:themeColor="accent1" w:val="4F81BD"/>
-    </w:rPr>
-  </w:style>
-  <w:style w:styleId="TOCHeading" w:type="paragraph">
+    <w:basedOn w:val="CaptionChar"/>
+    <w:rPr>
+      <w:color w:val="156082" w:themeColor="accent1"/>
+    </w:rPr>
+  </w:style>
+  <w:style w:type="paragraph" w:styleId="TOCHeading">
     <w:name w:val="TOC Heading"/>
     <w:basedOn w:val="Heading1"/>
     <w:next w:val="BodyText"/>
@@ -2782,246 +2964,305 @@
       <w:spacing w:before="240" w:line="259" w:lineRule="auto"/>
       <w:outlineLvl w:val="9"/>
     </w:pPr>
-    <w:rPr>
-      <w:rFonts w:asciiTheme="majorHAnsi" w:cstheme="majorBidi" w:eastAsiaTheme="majorEastAsia" w:hAnsiTheme="majorHAnsi"/>
-      <w:b w:val="0"/>
-      <w:bCs w:val="0"/>
-      <w:color w:themeColor="accent1" w:themeShade="BF" w:val="365F91"/>
-    </w:rPr>
   </w:style>
   <w:style w:type="paragraph" w:customStyle="1" w:styleId="SourceCode">
     <w:name w:val="Source Code"/>
     <w:basedOn w:val="Normal"/>
     <w:link w:val="VerbatimChar"/>
     <w:pPr>
-      <w:wordWrap w:val="off"/>
+      <w:wordWrap w:val="0"/>
     </w:pPr>
   </w:style>
   <w:style w:type="character" w:customStyle="1" w:styleId="KeywordTok">
     <w:name w:val="KeywordTok"/>
     <w:basedOn w:val="VerbatimChar"/>
     <w:rPr>
+      <w:rFonts w:ascii="Consolas" w:hAnsi="Consolas"/>
       <w:b/>
       <w:color w:val="007020"/>
+      <w:sz w:val="22"/>
     </w:rPr>
   </w:style>
   <w:style w:type="character" w:customStyle="1" w:styleId="DataTypeTok">
     <w:name w:val="DataTypeTok"/>
     <w:basedOn w:val="VerbatimChar"/>
     <w:rPr>
+      <w:rFonts w:ascii="Consolas" w:hAnsi="Consolas"/>
       <w:color w:val="902000"/>
+      <w:sz w:val="22"/>
     </w:rPr>
   </w:style>
   <w:style w:type="character" w:customStyle="1" w:styleId="DecValTok">
     <w:name w:val="DecValTok"/>
     <w:basedOn w:val="VerbatimChar"/>
     <w:rPr>
-      <w:color w:val="40a070"/>
+      <w:rFonts w:ascii="Consolas" w:hAnsi="Consolas"/>
+      <w:color w:val="40A070"/>
+      <w:sz w:val="22"/>
     </w:rPr>
   </w:style>
   <w:style w:type="character" w:customStyle="1" w:styleId="BaseNTok">
     <w:name w:val="BaseNTok"/>
     <w:basedOn w:val="VerbatimChar"/>
     <w:rPr>
-      <w:color w:val="40a070"/>
+      <w:rFonts w:ascii="Consolas" w:hAnsi="Consolas"/>
+      <w:color w:val="40A070"/>
+      <w:sz w:val="22"/>
     </w:rPr>
   </w:style>
   <w:style w:type="character" w:customStyle="1" w:styleId="FloatTok">
     <w:name w:val="FloatTok"/>
     <w:basedOn w:val="VerbatimChar"/>
     <w:rPr>
-      <w:color w:val="40a070"/>
+      <w:rFonts w:ascii="Consolas" w:hAnsi="Consolas"/>
+      <w:color w:val="40A070"/>
+      <w:sz w:val="22"/>
     </w:rPr>
   </w:style>
   <w:style w:type="character" w:customStyle="1" w:styleId="ConstantTok">
     <w:name w:val="ConstantTok"/>
     <w:basedOn w:val="VerbatimChar"/>
     <w:rPr>
+      <w:rFonts w:ascii="Consolas" w:hAnsi="Consolas"/>
       <w:color w:val="880000"/>
+      <w:sz w:val="22"/>
     </w:rPr>
   </w:style>
   <w:style w:type="character" w:customStyle="1" w:styleId="CharTok">
     <w:name w:val="CharTok"/>
     <w:basedOn w:val="VerbatimChar"/>
     <w:rPr>
-      <w:color w:val="4070a0"/>
+      <w:rFonts w:ascii="Consolas" w:hAnsi="Consolas"/>
+      <w:color w:val="4070A0"/>
+      <w:sz w:val="22"/>
     </w:rPr>
   </w:style>
   <w:style w:type="character" w:customStyle="1" w:styleId="SpecialCharTok">
     <w:name w:val="SpecialCharTok"/>
     <w:basedOn w:val="VerbatimChar"/>
     <w:rPr>
-      <w:color w:val="4070a0"/>
+      <w:rFonts w:ascii="Consolas" w:hAnsi="Consolas"/>
+      <w:color w:val="4070A0"/>
+      <w:sz w:val="22"/>
     </w:rPr>
   </w:style>
   <w:style w:type="character" w:customStyle="1" w:styleId="StringTok">
     <w:name w:val="StringTok"/>
     <w:basedOn w:val="VerbatimChar"/>
     <w:rPr>
-      <w:color w:val="4070a0"/>
+      <w:rFonts w:ascii="Consolas" w:hAnsi="Consolas"/>
+      <w:color w:val="4070A0"/>
+      <w:sz w:val="22"/>
     </w:rPr>
   </w:style>
   <w:style w:type="character" w:customStyle="1" w:styleId="VerbatimStringTok">
     <w:name w:val="VerbatimStringTok"/>
     <w:basedOn w:val="VerbatimChar"/>
     <w:rPr>
-      <w:color w:val="4070a0"/>
+      <w:rFonts w:ascii="Consolas" w:hAnsi="Consolas"/>
+      <w:color w:val="4070A0"/>
+      <w:sz w:val="22"/>
     </w:rPr>
   </w:style>
   <w:style w:type="character" w:customStyle="1" w:styleId="SpecialStringTok">
     <w:name w:val="SpecialStringTok"/>
     <w:basedOn w:val="VerbatimChar"/>
     <w:rPr>
-      <w:color w:val="bb6688"/>
+      <w:rFonts w:ascii="Consolas" w:hAnsi="Consolas"/>
+      <w:color w:val="BB6688"/>
+      <w:sz w:val="22"/>
     </w:rPr>
   </w:style>
   <w:style w:type="character" w:customStyle="1" w:styleId="ImportTok">
     <w:name w:val="ImportTok"/>
     <w:basedOn w:val="VerbatimChar"/>
     <w:rPr>
+      <w:rFonts w:ascii="Consolas" w:hAnsi="Consolas"/>
       <w:b/>
       <w:color w:val="008000"/>
+      <w:sz w:val="22"/>
     </w:rPr>
   </w:style>
   <w:style w:type="character" w:customStyle="1" w:styleId="CommentTok">
     <w:name w:val="CommentTok"/>
     <w:basedOn w:val="VerbatimChar"/>
     <w:rPr>
+      <w:rFonts w:ascii="Consolas" w:hAnsi="Consolas"/>
       <w:i/>
-      <w:color w:val="60a0b0"/>
+      <w:color w:val="60A0B0"/>
+      <w:sz w:val="22"/>
     </w:rPr>
   </w:style>
   <w:style w:type="character" w:customStyle="1" w:styleId="DocumentationTok">
     <w:name w:val="DocumentationTok"/>
     <w:basedOn w:val="VerbatimChar"/>
     <w:rPr>
+      <w:rFonts w:ascii="Consolas" w:hAnsi="Consolas"/>
       <w:i/>
-      <w:color w:val="ba2121"/>
+      <w:color w:val="BA2121"/>
+      <w:sz w:val="22"/>
     </w:rPr>
   </w:style>
   <w:style w:type="character" w:customStyle="1" w:styleId="AnnotationTok">
     <w:name w:val="AnnotationTok"/>
     <w:basedOn w:val="VerbatimChar"/>
     <w:rPr>
+      <w:rFonts w:ascii="Consolas" w:hAnsi="Consolas"/>
       <w:b/>
       <w:i/>
-      <w:color w:val="60a0b0"/>
+      <w:color w:val="60A0B0"/>
+      <w:sz w:val="22"/>
     </w:rPr>
   </w:style>
   <w:style w:type="character" w:customStyle="1" w:styleId="CommentVarTok">
     <w:name w:val="CommentVarTok"/>
     <w:basedOn w:val="VerbatimChar"/>
     <w:rPr>
+      <w:rFonts w:ascii="Consolas" w:hAnsi="Consolas"/>
       <w:b/>
       <w:i/>
-      <w:color w:val="60a0b0"/>
+      <w:color w:val="60A0B0"/>
+      <w:sz w:val="22"/>
     </w:rPr>
   </w:style>
   <w:style w:type="character" w:customStyle="1" w:styleId="OtherTok">
     <w:name w:val="OtherTok"/>
     <w:basedOn w:val="VerbatimChar"/>
     <w:rPr>
+      <w:rFonts w:ascii="Consolas" w:hAnsi="Consolas"/>
       <w:color w:val="007020"/>
+      <w:sz w:val="22"/>
     </w:rPr>
   </w:style>
   <w:style w:type="character" w:customStyle="1" w:styleId="FunctionTok">
     <w:name w:val="FunctionTok"/>
     <w:basedOn w:val="VerbatimChar"/>
     <w:rPr>
-      <w:color w:val="06287e"/>
+      <w:rFonts w:ascii="Consolas" w:hAnsi="Consolas"/>
+      <w:color w:val="06287E"/>
+      <w:sz w:val="22"/>
     </w:rPr>
   </w:style>
   <w:style w:type="character" w:customStyle="1" w:styleId="VariableTok">
     <w:name w:val="VariableTok"/>
     <w:basedOn w:val="VerbatimChar"/>
     <w:rPr>
-      <w:color w:val="19177c"/>
+      <w:rFonts w:ascii="Consolas" w:hAnsi="Consolas"/>
+      <w:color w:val="19177C"/>
+      <w:sz w:val="22"/>
     </w:rPr>
   </w:style>
   <w:style w:type="character" w:customStyle="1" w:styleId="ControlFlowTok">
     <w:name w:val="ControlFlowTok"/>
     <w:basedOn w:val="VerbatimChar"/>
     <w:rPr>
+      <w:rFonts w:ascii="Consolas" w:hAnsi="Consolas"/>
       <w:b/>
       <w:color w:val="007020"/>
+      <w:sz w:val="22"/>
     </w:rPr>
   </w:style>
   <w:style w:type="character" w:customStyle="1" w:styleId="OperatorTok">
     <w:name w:val="OperatorTok"/>
     <w:basedOn w:val="VerbatimChar"/>
     <w:rPr>
+      <w:rFonts w:ascii="Consolas" w:hAnsi="Consolas"/>
       <w:color w:val="666666"/>
+      <w:sz w:val="22"/>
     </w:rPr>
   </w:style>
   <w:style w:type="character" w:customStyle="1" w:styleId="BuiltInTok">
     <w:name w:val="BuiltInTok"/>
     <w:basedOn w:val="VerbatimChar"/>
     <w:rPr>
+      <w:rFonts w:ascii="Consolas" w:hAnsi="Consolas"/>
       <w:color w:val="008000"/>
+      <w:sz w:val="22"/>
     </w:rPr>
   </w:style>
   <w:style w:type="character" w:customStyle="1" w:styleId="ExtensionTok">
     <w:name w:val="ExtensionTok"/>
     <w:basedOn w:val="VerbatimChar"/>
-    <w:rPr/>
+    <w:rPr>
+      <w:rFonts w:ascii="Consolas" w:hAnsi="Consolas"/>
+      <w:sz w:val="22"/>
+    </w:rPr>
   </w:style>
   <w:style w:type="character" w:customStyle="1" w:styleId="PreprocessorTok">
     <w:name w:val="PreprocessorTok"/>
     <w:basedOn w:val="VerbatimChar"/>
     <w:rPr>
-      <w:color w:val="bc7a00"/>
+      <w:rFonts w:ascii="Consolas" w:hAnsi="Consolas"/>
+      <w:color w:val="BC7A00"/>
+      <w:sz w:val="22"/>
     </w:rPr>
   </w:style>
   <w:style w:type="character" w:customStyle="1" w:styleId="AttributeTok">
     <w:name w:val="AttributeTok"/>
     <w:basedOn w:val="VerbatimChar"/>
     <w:rPr>
-      <w:color w:val="7d9029"/>
+      <w:rFonts w:ascii="Consolas" w:hAnsi="Consolas"/>
+      <w:color w:val="7D9029"/>
+      <w:sz w:val="22"/>
     </w:rPr>
   </w:style>
   <w:style w:type="character" w:customStyle="1" w:styleId="RegionMarkerTok">
     <w:name w:val="RegionMarkerTok"/>
     <w:basedOn w:val="VerbatimChar"/>
-    <w:rPr/>
+    <w:rPr>
+      <w:rFonts w:ascii="Consolas" w:hAnsi="Consolas"/>
+      <w:sz w:val="22"/>
+    </w:rPr>
   </w:style>
   <w:style w:type="character" w:customStyle="1" w:styleId="InformationTok">
     <w:name w:val="InformationTok"/>
     <w:basedOn w:val="VerbatimChar"/>
     <w:rPr>
+      <w:rFonts w:ascii="Consolas" w:hAnsi="Consolas"/>
       <w:b/>
       <w:i/>
-      <w:color w:val="60a0b0"/>
+      <w:color w:val="60A0B0"/>
+      <w:sz w:val="22"/>
     </w:rPr>
   </w:style>
   <w:style w:type="character" w:customStyle="1" w:styleId="WarningTok">
     <w:name w:val="WarningTok"/>
     <w:basedOn w:val="VerbatimChar"/>
     <w:rPr>
+      <w:rFonts w:ascii="Consolas" w:hAnsi="Consolas"/>
       <w:b/>
       <w:i/>
-      <w:color w:val="60a0b0"/>
+      <w:color w:val="60A0B0"/>
+      <w:sz w:val="22"/>
     </w:rPr>
   </w:style>
   <w:style w:type="character" w:customStyle="1" w:styleId="AlertTok">
     <w:name w:val="AlertTok"/>
     <w:basedOn w:val="VerbatimChar"/>
     <w:rPr>
+      <w:rFonts w:ascii="Consolas" w:hAnsi="Consolas"/>
       <w:b/>
-      <w:color w:val="ff0000"/>
+      <w:color w:val="FF0000"/>
+      <w:sz w:val="22"/>
     </w:rPr>
   </w:style>
   <w:style w:type="character" w:customStyle="1" w:styleId="ErrorTok">
     <w:name w:val="ErrorTok"/>
     <w:basedOn w:val="VerbatimChar"/>
     <w:rPr>
+      <w:rFonts w:ascii="Consolas" w:hAnsi="Consolas"/>
       <w:b/>
-      <w:color w:val="ff0000"/>
+      <w:color w:val="FF0000"/>
+      <w:sz w:val="22"/>
     </w:rPr>
   </w:style>
   <w:style w:type="character" w:customStyle="1" w:styleId="NormalTok">
     <w:name w:val="NormalTok"/>
     <w:basedOn w:val="VerbatimChar"/>
-    <w:rPr/>
+    <w:rPr>
+      <w:rFonts w:ascii="Consolas" w:hAnsi="Consolas"/>
+      <w:sz w:val="22"/>
+    </w:rPr>
   </w:style>
 </w:styles>
 </file>

</xml_diff>